<commit_message>
Update maintenance guide with staging workflow
</commit_message>
<xml_diff>
--- a/website-maintenance-guide.docx
+++ b/website-maintenance-guide.docx
@@ -500,7 +500,7 @@
             <w:pPr>
               <w:spacing w:after="0" w:before="0"/>
             </w:pPr>
-            <w:hyperlink w:history="1" r:id="rIdzilyq6akdim69vcmestda">
+            <w:hyperlink w:history="1" r:id="rId6b4w2w5f6zanmjxdyod3o">
               <w:r>
                 <w:rPr>
                   <w:rStyle w:val="Hyperlink"/>
@@ -628,7 +628,7 @@
             <w:pPr>
               <w:spacing w:after="0" w:before="0"/>
             </w:pPr>
-            <w:hyperlink w:history="1" r:id="rId3fcduptejeu2n5ddluwgr">
+            <w:hyperlink w:history="1" r:id="rIdehvq3tzrmpakxak2pr_1s">
               <w:r>
                 <w:rPr>
                   <w:rStyle w:val="Hyperlink"/>
@@ -753,7 +753,7 @@
             <w:pPr>
               <w:spacing w:after="0" w:before="0"/>
             </w:pPr>
-            <w:hyperlink w:history="1" r:id="rIdvihbbpxqggrz_hzarxhkt">
+            <w:hyperlink w:history="1" r:id="rIdxl7bjrooksv2pgeirhnna">
               <w:r>
                 <w:rPr>
                   <w:rStyle w:val="Hyperlink"/>
@@ -6825,7 +6825,7 @@
           <w:sz w:val="20"/>
           <w:szCs w:val="20"/>
         </w:rPr>
-        <w:t xml:space="preserve">Every change you save is only on your computer until you publish it. Publishing is done using three Git commands that you type into the Terminal in PyCharm.</w:t>
+        <w:t xml:space="preserve">Every change you save is only on your computer until you publish it. The website uses two separate branches (versions) to keep changes safe before they go live.</w:t>
       </w:r>
     </w:p>
     <w:p>
@@ -6906,7 +6906,7 @@
                 <w:sz w:val="19"/>
                 <w:szCs w:val="19"/>
               </w:rPr>
-              <w:t xml:space="preserve">Git is a system that tracks every change you make to the website files, like a detailed save history. When you push, it sends your saved changes to GitHub, which then automatically triggers Cloudflare to rebuild and update the live website at creatinglinks.org.</w:t>
+              <w:t xml:space="preserve">Git is a system that tracks every change you make to the website files, like a detailed save history. When you push, it sends your saved changes to GitHub, which then automatically triggers Cloudflare to rebuild and deploy the website.</w:t>
             </w:r>
           </w:p>
         </w:tc>
@@ -6944,7 +6944,7 @@
           <w:sz w:val="28"/>
           <w:szCs w:val="28"/>
         </w:rPr>
-        <w:t xml:space="preserve">The Three Publishing Commands</w:t>
+        <w:t xml:space="preserve">Two Branches: staging and main</w:t>
       </w:r>
     </w:p>
     <w:p>
@@ -6962,7 +6962,7 @@
           <w:sz w:val="20"/>
           <w:szCs w:val="20"/>
         </w:rPr>
-        <w:t xml:space="preserve">After making and saving your changes, type these three commands in the Terminal one at a time, pressing Enter after each:</w:t>
+        <w:t xml:space="preserve">Think of branches like two parallel copies of the website:</w:t>
       </w:r>
     </w:p>
     <w:p>
@@ -6985,19 +6985,62 @@
     </w:p>
     <w:p>
       <w:pPr>
-        <w:pStyle w:val="Heading3"/>
-        <w:spacing w:after="120" w:before="240"/>
-      </w:pPr>
-      <w:r>
-        <w:rPr>
-          <w:rFonts w:ascii="Arial" w:cs="Arial" w:eastAsia="Arial" w:hAnsi="Arial"/>
-          <w:b/>
-          <w:bCs/>
-          <w:color w:val="1f2937"/>
-          <w:sz w:val="24"/>
-          <w:szCs w:val="24"/>
-        </w:rPr>
-        <w:t xml:space="preserve">Command 1 — Stage your changes</w:t>
+        <w:pStyle w:val="ListParagraph"/>
+        <w:numPr>
+          <w:ilvl w:val="0"/>
+          <w:numId w:val="3"/>
+        </w:numPr>
+        <w:spacing w:after="100" w:before="0"/>
+      </w:pPr>
+      <w:r>
+        <w:rPr>
+          <w:rFonts w:ascii="Arial" w:cs="Arial" w:eastAsia="Arial" w:hAnsi="Arial"/>
+          <w:b w:val="false"/>
+          <w:bCs w:val="false"/>
+          <w:color w:val="1f2937"/>
+          <w:sz w:val="20"/>
+          <w:szCs w:val="20"/>
+        </w:rPr>
+        <w:t xml:space="preserve">staging — your personal drafting area. Changes here go to a private preview URL that only you can see. Use this to check everything looks correct before anyone else sees it.</w:t>
+      </w:r>
+    </w:p>
+    <w:p>
+      <w:pPr>
+        <w:pStyle w:val="ListParagraph"/>
+        <w:numPr>
+          <w:ilvl w:val="0"/>
+          <w:numId w:val="3"/>
+        </w:numPr>
+        <w:spacing w:after="100" w:before="0"/>
+      </w:pPr>
+      <w:r>
+        <w:rPr>
+          <w:rFonts w:ascii="Arial" w:cs="Arial" w:eastAsia="Arial" w:hAnsi="Arial"/>
+          <w:b w:val="false"/>
+          <w:bCs w:val="false"/>
+          <w:color w:val="1f2937"/>
+          <w:sz w:val="20"/>
+          <w:szCs w:val="20"/>
+        </w:rPr>
+        <w:t xml:space="preserve">main — the live website at creatinglinks.org. Only merge changes here once you are happy with the preview.</w:t>
+      </w:r>
+    </w:p>
+    <w:p>
+      <w:pPr>
+        <w:spacing w:after="160" w:before="0"/>
+      </w:pPr>
+      <w:r>
+        <w:rPr>
+          <w:rFonts w:ascii="Arial" w:cs="Arial" w:eastAsia="Arial" w:hAnsi="Arial"/>
+          <w:b w:val="false"/>
+          <w:bCs w:val="false"/>
+          <w:i w:val="false"/>
+          <w:iCs w:val="false"/>
+          <w:color w:val="1f2937"/>
+          <w:sz w:val="20"/>
+          <w:szCs w:val="20"/>
+        </w:rPr>
+        <w:t xml:space="preserve"/>
       </w:r>
     </w:p>
     <w:tbl>
@@ -7019,32 +7062,48 @@
         <w:tc>
           <w:tcPr>
             <w:tcBorders>
-              <w:top w:val="single" w:color="cbd5e1" w:sz="1"/>
-              <w:left w:val="single" w:color="cbd5e1" w:sz="1"/>
-              <w:bottom w:val="single" w:color="cbd5e1" w:sz="1"/>
-              <w:right w:val="single" w:color="cbd5e1" w:sz="1"/>
-            </w:tcBorders>
-            <w:shd w:fill="f1f5f9" w:val="clear"/>
-            <w:tcMar>
-              <w:top w:type="dxa" w:w="100"/>
-              <w:left w:type="dxa" w:w="150"/>
-              <w:bottom w:type="dxa" w:w="100"/>
-              <w:right w:type="dxa" w:w="150"/>
-            </w:tcMar>
-            <w:vAlign w:val="top"/>
-          </w:tcPr>
-          <w:p>
-            <w:pPr>
-              <w:spacing w:after="60" w:before="0"/>
-            </w:pPr>
-            <w:r>
-              <w:rPr>
-                <w:rFonts w:ascii="Courier New" w:cs="Courier New" w:eastAsia="Courier New" w:hAnsi="Courier New"/>
-                <w:color w:val="1e40af"/>
-                <w:sz w:val="18"/>
-                <w:szCs w:val="18"/>
-              </w:rPr>
-              <w:t xml:space="preserve">git add .</w:t>
+              <w:top w:val="single" w:color="FFE4B5" w:sz="1"/>
+              <w:left w:val="single" w:color="FFE4B5" w:sz="1"/>
+              <w:bottom w:val="single" w:color="FFE4B5" w:sz="1"/>
+              <w:right w:val="single" w:color="FFE4B5" w:sz="1"/>
+            </w:tcBorders>
+            <w:shd w:fill="FFE4B5" w:val="clear"/>
+            <w:tcMar>
+              <w:top w:type="dxa" w:w="100"/>
+              <w:left w:type="dxa" w:w="150"/>
+              <w:bottom w:type="dxa" w:w="100"/>
+              <w:right w:type="dxa" w:w="150"/>
+            </w:tcMar>
+            <w:vAlign w:val="top"/>
+          </w:tcPr>
+          <w:p>
+            <w:pPr>
+              <w:spacing w:after="80" w:before="0"/>
+            </w:pPr>
+            <w:r>
+              <w:rPr>
+                <w:rFonts w:ascii="Arial" w:cs="Arial" w:eastAsia="Arial" w:hAnsi="Arial"/>
+                <w:b/>
+                <w:bCs/>
+                <w:color w:val="1f2937"/>
+                <w:sz w:val="20"/>
+                <w:szCs w:val="20"/>
+              </w:rPr>
+              <w:t xml:space="preserve">⚠️  Important rule</w:t>
+            </w:r>
+          </w:p>
+          <w:p>
+            <w:pPr>
+              <w:spacing w:after="0" w:before="0"/>
+            </w:pPr>
+            <w:r>
+              <w:rPr>
+                <w:rFonts w:ascii="Arial" w:cs="Arial" w:eastAsia="Arial" w:hAnsi="Arial"/>
+                <w:color w:val="1f2937"/>
+                <w:sz w:val="19"/>
+                <w:szCs w:val="19"/>
+              </w:rPr>
+              <w:t xml:space="preserve">Always make changes on the staging branch. Never push changes directly to main. This protects the live website from accidental mistakes.</w:t>
             </w:r>
           </w:p>
         </w:tc>
@@ -7065,7 +7124,24 @@
           <w:sz w:val="20"/>
           <w:szCs w:val="20"/>
         </w:rPr>
-        <w:t xml:space="preserve">The dot means 'include all changed files'. This tells Git which files you want to include in the next save.</w:t>
+        <w:t xml:space="preserve"/>
+      </w:r>
+    </w:p>
+    <w:p>
+      <w:pPr>
+        <w:pStyle w:val="Heading2"/>
+        <w:spacing w:after="160" w:before="320"/>
+      </w:pPr>
+      <w:r>
+        <w:rPr>
+          <w:rFonts w:ascii="Arial" w:cs="Arial" w:eastAsia="Arial" w:hAnsi="Arial"/>
+          <w:b/>
+          <w:bCs/>
+          <w:color w:val="267c88"/>
+          <w:sz w:val="28"/>
+          <w:szCs w:val="28"/>
+        </w:rPr>
+        <w:t xml:space="preserve">Step 1 — Make sure you are on the staging branch</w:t>
       </w:r>
     </w:p>
     <w:p>
@@ -7083,24 +7159,7 @@
           <w:sz w:val="20"/>
           <w:szCs w:val="20"/>
         </w:rPr>
-        <w:t xml:space="preserve"/>
-      </w:r>
-    </w:p>
-    <w:p>
-      <w:pPr>
-        <w:pStyle w:val="Heading3"/>
-        <w:spacing w:after="120" w:before="240"/>
-      </w:pPr>
-      <w:r>
-        <w:rPr>
-          <w:rFonts w:ascii="Arial" w:cs="Arial" w:eastAsia="Arial" w:hAnsi="Arial"/>
-          <w:b/>
-          <w:bCs/>
-          <w:color w:val="1f2937"/>
-          <w:sz w:val="24"/>
-          <w:szCs w:val="24"/>
-        </w:rPr>
-        <w:t xml:space="preserve">Command 2 — Save with a description</w:t>
+        <w:t xml:space="preserve">Before editing anything, open the Terminal in PyCharm and type:</w:t>
       </w:r>
     </w:p>
     <w:tbl>
@@ -7147,7 +7206,7 @@
                 <w:sz w:val="18"/>
                 <w:szCs w:val="18"/>
               </w:rPr>
-              <w:t xml:space="preserve">git commit -m "Update team member bio for Shweta"</w:t>
+              <w:t xml:space="preserve">git checkout staging</w:t>
             </w:r>
           </w:p>
         </w:tc>
@@ -7168,7 +7227,7 @@
           <w:sz w:val="20"/>
           <w:szCs w:val="20"/>
         </w:rPr>
-        <w:t xml:space="preserve">Replace the text inside the quotes with a short description of what you changed. This description is only for your records — it helps you look back and understand what was changed when.</w:t>
+        <w:t xml:space="preserve">You will see a message like 'Switched to branch staging'. You only need to do this once per session; PyCharm remembers which branch you are on.</w:t>
       </w:r>
     </w:p>
     <w:p>
@@ -7191,6 +7250,76 @@
     </w:p>
     <w:p>
       <w:pPr>
+        <w:pStyle w:val="Heading2"/>
+        <w:spacing w:after="160" w:before="320"/>
+      </w:pPr>
+      <w:r>
+        <w:rPr>
+          <w:rFonts w:ascii="Arial" w:cs="Arial" w:eastAsia="Arial" w:hAnsi="Arial"/>
+          <w:b/>
+          <w:bCs/>
+          <w:color w:val="267c88"/>
+          <w:sz w:val="28"/>
+          <w:szCs w:val="28"/>
+        </w:rPr>
+        <w:t xml:space="preserve">Step 2 — Edit files and save in PyCharm</w:t>
+      </w:r>
+    </w:p>
+    <w:p>
+      <w:pPr>
+        <w:spacing w:after="160" w:before="0"/>
+      </w:pPr>
+      <w:r>
+        <w:rPr>
+          <w:rFonts w:ascii="Arial" w:cs="Arial" w:eastAsia="Arial" w:hAnsi="Arial"/>
+          <w:b w:val="false"/>
+          <w:bCs w:val="false"/>
+          <w:i w:val="false"/>
+          <w:iCs w:val="false"/>
+          <w:color w:val="1f2937"/>
+          <w:sz w:val="20"/>
+          <w:szCs w:val="20"/>
+        </w:rPr>
+        <w:t xml:space="preserve">Make your changes as normal (team members, reviews, services, etc.) and save the files.</w:t>
+      </w:r>
+    </w:p>
+    <w:p>
+      <w:pPr>
+        <w:spacing w:after="160" w:before="0"/>
+      </w:pPr>
+      <w:r>
+        <w:rPr>
+          <w:rFonts w:ascii="Arial" w:cs="Arial" w:eastAsia="Arial" w:hAnsi="Arial"/>
+          <w:b w:val="false"/>
+          <w:bCs w:val="false"/>
+          <w:i w:val="false"/>
+          <w:iCs w:val="false"/>
+          <w:color w:val="1f2937"/>
+          <w:sz w:val="20"/>
+          <w:szCs w:val="20"/>
+        </w:rPr>
+        <w:t xml:space="preserve"/>
+      </w:r>
+    </w:p>
+    <w:p>
+      <w:pPr>
+        <w:pStyle w:val="Heading2"/>
+        <w:spacing w:after="160" w:before="320"/>
+      </w:pPr>
+      <w:r>
+        <w:rPr>
+          <w:rFonts w:ascii="Arial" w:cs="Arial" w:eastAsia="Arial" w:hAnsi="Arial"/>
+          <w:b/>
+          <w:bCs/>
+          <w:color w:val="267c88"/>
+          <w:sz w:val="28"/>
+          <w:szCs w:val="28"/>
+        </w:rPr>
+        <w:t xml:space="preserve">Step 3 — Stage and commit your changes</w:t>
+      </w:r>
+    </w:p>
+    <w:p>
+      <w:pPr>
         <w:pStyle w:val="Heading3"/>
         <w:spacing w:after="120" w:before="240"/>
       </w:pPr>
@@ -7203,7 +7332,7 @@
           <w:sz w:val="24"/>
           <w:szCs w:val="24"/>
         </w:rPr>
-        <w:t xml:space="preserve">Command 3 — Publish to the live site</w:t>
+        <w:t xml:space="preserve">Command 1 — Stage your changes</w:t>
       </w:r>
     </w:p>
     <w:tbl>
@@ -7250,7 +7379,7 @@
                 <w:sz w:val="18"/>
                 <w:szCs w:val="18"/>
               </w:rPr>
-              <w:t xml:space="preserve">git push</w:t>
+              <w:t xml:space="preserve">git add .</w:t>
             </w:r>
           </w:p>
         </w:tc>
@@ -7271,7 +7400,7 @@
           <w:sz w:val="20"/>
           <w:szCs w:val="20"/>
         </w:rPr>
-        <w:t xml:space="preserve">This sends your saved changes to GitHub. Cloudflare Pages detects the update and automatically rebuilds the live website. This usually takes 30 to 60 seconds.</w:t>
+        <w:t xml:space="preserve">The dot means 'include all changed files'. This tells Git which files you want to include in the next save.</w:t>
       </w:r>
     </w:p>
     <w:p>
@@ -7290,6 +7419,23 @@
           <w:szCs w:val="20"/>
         </w:rPr>
         <w:t xml:space="preserve"/>
+      </w:r>
+    </w:p>
+    <w:p>
+      <w:pPr>
+        <w:pStyle w:val="Heading3"/>
+        <w:spacing w:after="120" w:before="240"/>
+      </w:pPr>
+      <w:r>
+        <w:rPr>
+          <w:rFonts w:ascii="Arial" w:cs="Arial" w:eastAsia="Arial" w:hAnsi="Arial"/>
+          <w:b/>
+          <w:bCs/>
+          <w:color w:val="1f2937"/>
+          <w:sz w:val="24"/>
+          <w:szCs w:val="24"/>
+        </w:rPr>
+        <w:t xml:space="preserve">Command 2 — Save with a description</w:t>
       </w:r>
     </w:p>
     <w:tbl>
@@ -7311,53 +7457,55 @@
         <w:tc>
           <w:tcPr>
             <w:tcBorders>
-              <w:top w:val="single" w:color="e0f2f1" w:sz="1"/>
-              <w:left w:val="single" w:color="e0f2f1" w:sz="1"/>
-              <w:bottom w:val="single" w:color="e0f2f1" w:sz="1"/>
-              <w:right w:val="single" w:color="e0f2f1" w:sz="1"/>
-            </w:tcBorders>
-            <w:shd w:fill="e0f2f1" w:val="clear"/>
-            <w:tcMar>
-              <w:top w:type="dxa" w:w="100"/>
-              <w:left w:type="dxa" w:w="150"/>
-              <w:bottom w:type="dxa" w:w="100"/>
-              <w:right w:type="dxa" w:w="150"/>
-            </w:tcMar>
-            <w:vAlign w:val="top"/>
-          </w:tcPr>
-          <w:p>
-            <w:pPr>
-              <w:spacing w:after="80" w:before="0"/>
-            </w:pPr>
-            <w:r>
-              <w:rPr>
-                <w:rFonts w:ascii="Arial" w:cs="Arial" w:eastAsia="Arial" w:hAnsi="Arial"/>
-                <w:b/>
-                <w:bCs/>
-                <w:color w:val="1f2937"/>
-                <w:sz w:val="20"/>
-                <w:szCs w:val="20"/>
-              </w:rPr>
-              <w:t xml:space="preserve">💡  How to confirm it worked</w:t>
-            </w:r>
-          </w:p>
-          <w:p>
-            <w:pPr>
-              <w:spacing w:after="0" w:before="0"/>
-            </w:pPr>
-            <w:r>
-              <w:rPr>
-                <w:rFonts w:ascii="Arial" w:cs="Arial" w:eastAsia="Arial" w:hAnsi="Arial"/>
-                <w:color w:val="1f2937"/>
-                <w:sz w:val="19"/>
-                <w:szCs w:val="19"/>
-              </w:rPr>
-              <w:t xml:space="preserve">Go to dash.cloudflare.com → Workers &amp; Pages → your project. You will see a new deployment entry at the top with a green tick once it finishes. Then visit creatinglinks.org to see your changes live.</w:t>
+              <w:top w:val="single" w:color="cbd5e1" w:sz="1"/>
+              <w:left w:val="single" w:color="cbd5e1" w:sz="1"/>
+              <w:bottom w:val="single" w:color="cbd5e1" w:sz="1"/>
+              <w:right w:val="single" w:color="cbd5e1" w:sz="1"/>
+            </w:tcBorders>
+            <w:shd w:fill="f1f5f9" w:val="clear"/>
+            <w:tcMar>
+              <w:top w:type="dxa" w:w="100"/>
+              <w:left w:type="dxa" w:w="150"/>
+              <w:bottom w:type="dxa" w:w="100"/>
+              <w:right w:type="dxa" w:w="150"/>
+            </w:tcMar>
+            <w:vAlign w:val="top"/>
+          </w:tcPr>
+          <w:p>
+            <w:pPr>
+              <w:spacing w:after="60" w:before="0"/>
+            </w:pPr>
+            <w:r>
+              <w:rPr>
+                <w:rFonts w:ascii="Courier New" w:cs="Courier New" w:eastAsia="Courier New" w:hAnsi="Courier New"/>
+                <w:color w:val="1e40af"/>
+                <w:sz w:val="18"/>
+                <w:szCs w:val="18"/>
+              </w:rPr>
+              <w:t xml:space="preserve">git commit -m "Update team member bio for Shweta"</w:t>
             </w:r>
           </w:p>
         </w:tc>
       </w:tr>
     </w:tbl>
+    <w:p>
+      <w:pPr>
+        <w:spacing w:after="160" w:before="0"/>
+      </w:pPr>
+      <w:r>
+        <w:rPr>
+          <w:rFonts w:ascii="Arial" w:cs="Arial" w:eastAsia="Arial" w:hAnsi="Arial"/>
+          <w:b w:val="false"/>
+          <w:bCs w:val="false"/>
+          <w:i w:val="false"/>
+          <w:iCs w:val="false"/>
+          <w:color w:val="1f2937"/>
+          <w:sz w:val="20"/>
+          <w:szCs w:val="20"/>
+        </w:rPr>
+        <w:t xml:space="preserve">Replace the text inside the quotes with a short description of what you changed.</w:t>
+      </w:r>
+    </w:p>
     <w:p>
       <w:pPr>
         <w:spacing w:after="160" w:before="0"/>
@@ -7390,25 +7538,24 @@
           <w:sz w:val="28"/>
           <w:szCs w:val="28"/>
         </w:rPr>
-        <w:t xml:space="preserve">Full Publishing Example</w:t>
-      </w:r>
-    </w:p>
-    <w:p>
-      <w:pPr>
-        <w:spacing w:after="160" w:before="0"/>
-      </w:pPr>
-      <w:r>
-        <w:rPr>
-          <w:rFonts w:ascii="Arial" w:cs="Arial" w:eastAsia="Arial" w:hAnsi="Arial"/>
-          <w:b w:val="false"/>
-          <w:bCs w:val="false"/>
-          <w:i w:val="false"/>
-          <w:iCs w:val="false"/>
-          <w:color w:val="1f2937"/>
-          <w:sz w:val="20"/>
-          <w:szCs w:val="20"/>
-        </w:rPr>
-        <w:t xml:space="preserve">Here is what a complete editing session looks like from start to finish:</w:t>
+        <w:t xml:space="preserve">Step 4 — Push to staging and review the preview</w:t>
+      </w:r>
+    </w:p>
+    <w:p>
+      <w:pPr>
+        <w:pStyle w:val="Heading3"/>
+        <w:spacing w:after="120" w:before="240"/>
+      </w:pPr>
+      <w:r>
+        <w:rPr>
+          <w:rFonts w:ascii="Arial" w:cs="Arial" w:eastAsia="Arial" w:hAnsi="Arial"/>
+          <w:b/>
+          <w:bCs/>
+          <w:color w:val="1f2937"/>
+          <w:sz w:val="24"/>
+          <w:szCs w:val="24"/>
+        </w:rPr>
+        <w:t xml:space="preserve">Command 3 — Publish to the staging preview</w:t>
       </w:r>
     </w:p>
     <w:tbl>
@@ -7455,7 +7602,248 @@
                 <w:sz w:val="18"/>
                 <w:szCs w:val="18"/>
               </w:rPr>
-              <w:t xml:space="preserve"># 1. Start a preview (optional)</w:t>
+              <w:t xml:space="preserve">git push origin staging</w:t>
+            </w:r>
+          </w:p>
+        </w:tc>
+      </w:tr>
+    </w:tbl>
+    <w:p>
+      <w:pPr>
+        <w:spacing w:after="160" w:before="0"/>
+      </w:pPr>
+      <w:r>
+        <w:rPr>
+          <w:rFonts w:ascii="Arial" w:cs="Arial" w:eastAsia="Arial" w:hAnsi="Arial"/>
+          <w:b w:val="false"/>
+          <w:bCs w:val="false"/>
+          <w:i w:val="false"/>
+          <w:iCs w:val="false"/>
+          <w:color w:val="1f2937"/>
+          <w:sz w:val="20"/>
+          <w:szCs w:val="20"/>
+        </w:rPr>
+        <w:t xml:space="preserve">This sends your changes to GitHub. Cloudflare Pages detects the update and automatically builds a preview. This takes about 30 to 60 seconds.</w:t>
+      </w:r>
+    </w:p>
+    <w:p>
+      <w:pPr>
+        <w:spacing w:after="160" w:before="0"/>
+      </w:pPr>
+      <w:r>
+        <w:rPr>
+          <w:rFonts w:ascii="Arial" w:cs="Arial" w:eastAsia="Arial" w:hAnsi="Arial"/>
+          <w:b w:val="false"/>
+          <w:bCs w:val="false"/>
+          <w:i w:val="false"/>
+          <w:iCs w:val="false"/>
+          <w:color w:val="1f2937"/>
+          <w:sz w:val="20"/>
+          <w:szCs w:val="20"/>
+        </w:rPr>
+        <w:t xml:space="preserve"/>
+      </w:r>
+    </w:p>
+    <w:tbl>
+      <w:tblPr>
+        <w:tblW w:type="dxa" w:w="9360"/>
+        <w:tblBorders>
+          <w:top w:val="single" w:color="auto" w:sz="4"/>
+          <w:left w:val="single" w:color="auto" w:sz="4"/>
+          <w:bottom w:val="single" w:color="auto" w:sz="4"/>
+          <w:right w:val="single" w:color="auto" w:sz="4"/>
+          <w:insideH w:val="single" w:color="auto" w:sz="4"/>
+          <w:insideV w:val="single" w:color="auto" w:sz="4"/>
+        </w:tblBorders>
+      </w:tblPr>
+      <w:tblGrid>
+        <w:gridCol w:w="9360"/>
+      </w:tblGrid>
+      <w:tr>
+        <w:tc>
+          <w:tcPr>
+            <w:tcBorders>
+              <w:top w:val="single" w:color="e0f2f1" w:sz="1"/>
+              <w:left w:val="single" w:color="e0f2f1" w:sz="1"/>
+              <w:bottom w:val="single" w:color="e0f2f1" w:sz="1"/>
+              <w:right w:val="single" w:color="e0f2f1" w:sz="1"/>
+            </w:tcBorders>
+            <w:shd w:fill="e0f2f1" w:val="clear"/>
+            <w:tcMar>
+              <w:top w:type="dxa" w:w="100"/>
+              <w:left w:type="dxa" w:w="150"/>
+              <w:bottom w:type="dxa" w:w="100"/>
+              <w:right w:type="dxa" w:w="150"/>
+            </w:tcMar>
+            <w:vAlign w:val="top"/>
+          </w:tcPr>
+          <w:p>
+            <w:pPr>
+              <w:spacing w:after="80" w:before="0"/>
+            </w:pPr>
+            <w:r>
+              <w:rPr>
+                <w:rFonts w:ascii="Arial" w:cs="Arial" w:eastAsia="Arial" w:hAnsi="Arial"/>
+                <w:b/>
+                <w:bCs/>
+                <w:color w:val="1f2937"/>
+                <w:sz w:val="20"/>
+                <w:szCs w:val="20"/>
+              </w:rPr>
+              <w:t xml:space="preserve">💡  How to find your preview URL</w:t>
+            </w:r>
+          </w:p>
+          <w:p>
+            <w:pPr>
+              <w:spacing w:after="0" w:before="0"/>
+            </w:pPr>
+            <w:r>
+              <w:rPr>
+                <w:rFonts w:ascii="Arial" w:cs="Arial" w:eastAsia="Arial" w:hAnsi="Arial"/>
+                <w:color w:val="1f2937"/>
+                <w:sz w:val="19"/>
+                <w:szCs w:val="19"/>
+              </w:rPr>
+              <w:t xml:space="preserve">Go to dash.cloudflare.com → Workers &amp; Pages → your project → Deployments. You will see a new entry labelled 'staging'. Click 'Visit' to open the preview URL and check your changes.</w:t>
+            </w:r>
+          </w:p>
+        </w:tc>
+      </w:tr>
+    </w:tbl>
+    <w:p>
+      <w:pPr>
+        <w:spacing w:after="160" w:before="0"/>
+      </w:pPr>
+      <w:r>
+        <w:rPr>
+          <w:rFonts w:ascii="Arial" w:cs="Arial" w:eastAsia="Arial" w:hAnsi="Arial"/>
+          <w:b w:val="false"/>
+          <w:bCs w:val="false"/>
+          <w:i w:val="false"/>
+          <w:iCs w:val="false"/>
+          <w:color w:val="1f2937"/>
+          <w:sz w:val="20"/>
+          <w:szCs w:val="20"/>
+        </w:rPr>
+        <w:t xml:space="preserve"/>
+      </w:r>
+    </w:p>
+    <w:p>
+      <w:pPr>
+        <w:spacing w:after="160" w:before="0"/>
+      </w:pPr>
+      <w:r>
+        <w:rPr>
+          <w:rFonts w:ascii="Arial" w:cs="Arial" w:eastAsia="Arial" w:hAnsi="Arial"/>
+          <w:b w:val="false"/>
+          <w:bCs w:val="false"/>
+          <w:i w:val="false"/>
+          <w:iCs w:val="false"/>
+          <w:color w:val="1f2937"/>
+          <w:sz w:val="20"/>
+          <w:szCs w:val="20"/>
+        </w:rPr>
+        <w:t xml:space="preserve">Share this preview URL with anyone whose feedback you want. Nothing is live yet — creatinglinks.org is untouched.</w:t>
+      </w:r>
+    </w:p>
+    <w:p>
+      <w:pPr>
+        <w:spacing w:after="160" w:before="0"/>
+      </w:pPr>
+      <w:r>
+        <w:rPr>
+          <w:rFonts w:ascii="Arial" w:cs="Arial" w:eastAsia="Arial" w:hAnsi="Arial"/>
+          <w:b w:val="false"/>
+          <w:bCs w:val="false"/>
+          <w:i w:val="false"/>
+          <w:iCs w:val="false"/>
+          <w:color w:val="1f2937"/>
+          <w:sz w:val="20"/>
+          <w:szCs w:val="20"/>
+        </w:rPr>
+        <w:t xml:space="preserve"/>
+      </w:r>
+    </w:p>
+    <w:p>
+      <w:pPr>
+        <w:pStyle w:val="Heading2"/>
+        <w:spacing w:after="160" w:before="320"/>
+      </w:pPr>
+      <w:r>
+        <w:rPr>
+          <w:rFonts w:ascii="Arial" w:cs="Arial" w:eastAsia="Arial" w:hAnsi="Arial"/>
+          <w:b/>
+          <w:bCs/>
+          <w:color w:val="267c88"/>
+          <w:sz w:val="28"/>
+          <w:szCs w:val="28"/>
+        </w:rPr>
+        <w:t xml:space="preserve">Step 5 — Merge to main when you are happy</w:t>
+      </w:r>
+    </w:p>
+    <w:p>
+      <w:pPr>
+        <w:spacing w:after="160" w:before="0"/>
+      </w:pPr>
+      <w:r>
+        <w:rPr>
+          <w:rFonts w:ascii="Arial" w:cs="Arial" w:eastAsia="Arial" w:hAnsi="Arial"/>
+          <w:b w:val="false"/>
+          <w:bCs w:val="false"/>
+          <w:i w:val="false"/>
+          <w:iCs w:val="false"/>
+          <w:color w:val="1f2937"/>
+          <w:sz w:val="20"/>
+          <w:szCs w:val="20"/>
+        </w:rPr>
+        <w:t xml:space="preserve">Once the preview looks correct, run these commands to publish the changes to the live website:</w:t>
+      </w:r>
+    </w:p>
+    <w:tbl>
+      <w:tblPr>
+        <w:tblW w:type="dxa" w:w="9360"/>
+        <w:tblBorders>
+          <w:top w:val="single" w:color="auto" w:sz="4"/>
+          <w:left w:val="single" w:color="auto" w:sz="4"/>
+          <w:bottom w:val="single" w:color="auto" w:sz="4"/>
+          <w:right w:val="single" w:color="auto" w:sz="4"/>
+          <w:insideH w:val="single" w:color="auto" w:sz="4"/>
+          <w:insideV w:val="single" w:color="auto" w:sz="4"/>
+        </w:tblBorders>
+      </w:tblPr>
+      <w:tblGrid>
+        <w:gridCol w:w="9360"/>
+      </w:tblGrid>
+      <w:tr>
+        <w:tc>
+          <w:tcPr>
+            <w:tcBorders>
+              <w:top w:val="single" w:color="cbd5e1" w:sz="1"/>
+              <w:left w:val="single" w:color="cbd5e1" w:sz="1"/>
+              <w:bottom w:val="single" w:color="cbd5e1" w:sz="1"/>
+              <w:right w:val="single" w:color="cbd5e1" w:sz="1"/>
+            </w:tcBorders>
+            <w:shd w:fill="f1f5f9" w:val="clear"/>
+            <w:tcMar>
+              <w:top w:type="dxa" w:w="100"/>
+              <w:left w:type="dxa" w:w="150"/>
+              <w:bottom w:type="dxa" w:w="100"/>
+              <w:right w:type="dxa" w:w="150"/>
+            </w:tcMar>
+            <w:vAlign w:val="top"/>
+          </w:tcPr>
+          <w:p>
+            <w:pPr>
+              <w:spacing w:after="60" w:before="0"/>
+            </w:pPr>
+            <w:r>
+              <w:rPr>
+                <w:rFonts w:ascii="Courier New" w:cs="Courier New" w:eastAsia="Courier New" w:hAnsi="Courier New"/>
+                <w:color w:val="1e40af"/>
+                <w:sz w:val="18"/>
+                <w:szCs w:val="18"/>
+              </w:rPr>
+              <w:t xml:space="preserve">git checkout main</w:t>
             </w:r>
           </w:p>
         </w:tc>
@@ -7505,7 +7893,7 @@
                 <w:sz w:val="18"/>
                 <w:szCs w:val="18"/>
               </w:rPr>
-              <w:t xml:space="preserve">npm run dev</w:t>
+              <w:t xml:space="preserve">git merge staging</w:t>
             </w:r>
           </w:p>
         </w:tc>
@@ -7555,7 +7943,212 @@
                 <w:sz w:val="18"/>
                 <w:szCs w:val="18"/>
               </w:rPr>
-              <w:t xml:space="preserve"/>
+              <w:t xml:space="preserve">git push origin main</w:t>
+            </w:r>
+          </w:p>
+        </w:tc>
+      </w:tr>
+    </w:tbl>
+    <w:p>
+      <w:pPr>
+        <w:spacing w:after="160" w:before="0"/>
+      </w:pPr>
+      <w:r>
+        <w:rPr>
+          <w:rFonts w:ascii="Arial" w:cs="Arial" w:eastAsia="Arial" w:hAnsi="Arial"/>
+          <w:b w:val="false"/>
+          <w:bCs w:val="false"/>
+          <w:i w:val="false"/>
+          <w:iCs w:val="false"/>
+          <w:color w:val="1f2937"/>
+          <w:sz w:val="20"/>
+          <w:szCs w:val="20"/>
+        </w:rPr>
+        <w:t xml:space="preserve">Cloudflare will rebuild the live site at creatinglinks.org within 60 seconds.</w:t>
+      </w:r>
+    </w:p>
+    <w:p>
+      <w:pPr>
+        <w:spacing w:after="160" w:before="0"/>
+      </w:pPr>
+      <w:r>
+        <w:rPr>
+          <w:rFonts w:ascii="Arial" w:cs="Arial" w:eastAsia="Arial" w:hAnsi="Arial"/>
+          <w:b w:val="false"/>
+          <w:bCs w:val="false"/>
+          <w:i w:val="false"/>
+          <w:iCs w:val="false"/>
+          <w:color w:val="1f2937"/>
+          <w:sz w:val="20"/>
+          <w:szCs w:val="20"/>
+        </w:rPr>
+        <w:t xml:space="preserve"/>
+      </w:r>
+    </w:p>
+    <w:tbl>
+      <w:tblPr>
+        <w:tblW w:type="dxa" w:w="9360"/>
+        <w:tblBorders>
+          <w:top w:val="single" w:color="auto" w:sz="4"/>
+          <w:left w:val="single" w:color="auto" w:sz="4"/>
+          <w:bottom w:val="single" w:color="auto" w:sz="4"/>
+          <w:right w:val="single" w:color="auto" w:sz="4"/>
+          <w:insideH w:val="single" w:color="auto" w:sz="4"/>
+          <w:insideV w:val="single" w:color="auto" w:sz="4"/>
+        </w:tblBorders>
+      </w:tblPr>
+      <w:tblGrid>
+        <w:gridCol w:w="9360"/>
+      </w:tblGrid>
+      <w:tr>
+        <w:tc>
+          <w:tcPr>
+            <w:tcBorders>
+              <w:top w:val="single" w:color="e0f2f1" w:sz="1"/>
+              <w:left w:val="single" w:color="e0f2f1" w:sz="1"/>
+              <w:bottom w:val="single" w:color="e0f2f1" w:sz="1"/>
+              <w:right w:val="single" w:color="e0f2f1" w:sz="1"/>
+            </w:tcBorders>
+            <w:shd w:fill="e0f2f1" w:val="clear"/>
+            <w:tcMar>
+              <w:top w:type="dxa" w:w="100"/>
+              <w:left w:type="dxa" w:w="150"/>
+              <w:bottom w:type="dxa" w:w="100"/>
+              <w:right w:type="dxa" w:w="150"/>
+            </w:tcMar>
+            <w:vAlign w:val="top"/>
+          </w:tcPr>
+          <w:p>
+            <w:pPr>
+              <w:spacing w:after="80" w:before="0"/>
+            </w:pPr>
+            <w:r>
+              <w:rPr>
+                <w:rFonts w:ascii="Arial" w:cs="Arial" w:eastAsia="Arial" w:hAnsi="Arial"/>
+                <w:b/>
+                <w:bCs/>
+                <w:color w:val="1f2937"/>
+                <w:sz w:val="20"/>
+                <w:szCs w:val="20"/>
+              </w:rPr>
+              <w:t xml:space="preserve">💡  After merging, switch back to staging</w:t>
+            </w:r>
+          </w:p>
+          <w:p>
+            <w:pPr>
+              <w:spacing w:after="0" w:before="0"/>
+            </w:pPr>
+            <w:r>
+              <w:rPr>
+                <w:rFonts w:ascii="Arial" w:cs="Arial" w:eastAsia="Arial" w:hAnsi="Arial"/>
+                <w:color w:val="1f2937"/>
+                <w:sz w:val="19"/>
+                <w:szCs w:val="19"/>
+              </w:rPr>
+              <w:t xml:space="preserve">Always return to the staging branch after merging so your next edit starts in the right place: git checkout staging</w:t>
+            </w:r>
+          </w:p>
+        </w:tc>
+      </w:tr>
+    </w:tbl>
+    <w:p>
+      <w:pPr>
+        <w:spacing w:after="160" w:before="0"/>
+      </w:pPr>
+      <w:r>
+        <w:rPr>
+          <w:rFonts w:ascii="Arial" w:cs="Arial" w:eastAsia="Arial" w:hAnsi="Arial"/>
+          <w:b w:val="false"/>
+          <w:bCs w:val="false"/>
+          <w:i w:val="false"/>
+          <w:iCs w:val="false"/>
+          <w:color w:val="1f2937"/>
+          <w:sz w:val="20"/>
+          <w:szCs w:val="20"/>
+        </w:rPr>
+        <w:t xml:space="preserve"/>
+      </w:r>
+    </w:p>
+    <w:p>
+      <w:pPr>
+        <w:pStyle w:val="Heading2"/>
+        <w:spacing w:after="160" w:before="320"/>
+      </w:pPr>
+      <w:r>
+        <w:rPr>
+          <w:rFonts w:ascii="Arial" w:cs="Arial" w:eastAsia="Arial" w:hAnsi="Arial"/>
+          <w:b/>
+          <w:bCs/>
+          <w:color w:val="267c88"/>
+          <w:sz w:val="28"/>
+          <w:szCs w:val="28"/>
+        </w:rPr>
+        <w:t xml:space="preserve">Full Publishing Example</w:t>
+      </w:r>
+    </w:p>
+    <w:p>
+      <w:pPr>
+        <w:spacing w:after="160" w:before="0"/>
+      </w:pPr>
+      <w:r>
+        <w:rPr>
+          <w:rFonts w:ascii="Arial" w:cs="Arial" w:eastAsia="Arial" w:hAnsi="Arial"/>
+          <w:b w:val="false"/>
+          <w:bCs w:val="false"/>
+          <w:i w:val="false"/>
+          <w:iCs w:val="false"/>
+          <w:color w:val="1f2937"/>
+          <w:sz w:val="20"/>
+          <w:szCs w:val="20"/>
+        </w:rPr>
+        <w:t xml:space="preserve">Here is what a complete editing session looks like from start to finish:</w:t>
+      </w:r>
+    </w:p>
+    <w:tbl>
+      <w:tblPr>
+        <w:tblW w:type="dxa" w:w="9360"/>
+        <w:tblBorders>
+          <w:top w:val="single" w:color="auto" w:sz="4"/>
+          <w:left w:val="single" w:color="auto" w:sz="4"/>
+          <w:bottom w:val="single" w:color="auto" w:sz="4"/>
+          <w:right w:val="single" w:color="auto" w:sz="4"/>
+          <w:insideH w:val="single" w:color="auto" w:sz="4"/>
+          <w:insideV w:val="single" w:color="auto" w:sz="4"/>
+        </w:tblBorders>
+      </w:tblPr>
+      <w:tblGrid>
+        <w:gridCol w:w="9360"/>
+      </w:tblGrid>
+      <w:tr>
+        <w:tc>
+          <w:tcPr>
+            <w:tcBorders>
+              <w:top w:val="single" w:color="cbd5e1" w:sz="1"/>
+              <w:left w:val="single" w:color="cbd5e1" w:sz="1"/>
+              <w:bottom w:val="single" w:color="cbd5e1" w:sz="1"/>
+              <w:right w:val="single" w:color="cbd5e1" w:sz="1"/>
+            </w:tcBorders>
+            <w:shd w:fill="f1f5f9" w:val="clear"/>
+            <w:tcMar>
+              <w:top w:type="dxa" w:w="100"/>
+              <w:left w:type="dxa" w:w="150"/>
+              <w:bottom w:type="dxa" w:w="100"/>
+              <w:right w:type="dxa" w:w="150"/>
+            </w:tcMar>
+            <w:vAlign w:val="top"/>
+          </w:tcPr>
+          <w:p>
+            <w:pPr>
+              <w:spacing w:after="60" w:before="0"/>
+            </w:pPr>
+            <w:r>
+              <w:rPr>
+                <w:rFonts w:ascii="Courier New" w:cs="Courier New" w:eastAsia="Courier New" w:hAnsi="Courier New"/>
+                <w:color w:val="1e40af"/>
+                <w:sz w:val="18"/>
+                <w:szCs w:val="18"/>
+              </w:rPr>
+              <w:t xml:space="preserve"># 1. Switch to the staging branch</w:t>
             </w:r>
           </w:p>
         </w:tc>
@@ -7605,7 +8198,7 @@
                 <w:sz w:val="18"/>
                 <w:szCs w:val="18"/>
               </w:rPr>
-              <w:t xml:space="preserve"># 2. Make your edits and save files in PyCharm</w:t>
+              <w:t xml:space="preserve">git checkout staging</w:t>
             </w:r>
           </w:p>
         </w:tc>
@@ -7705,7 +8298,7 @@
                 <w:sz w:val="18"/>
                 <w:szCs w:val="18"/>
               </w:rPr>
-              <w:t xml:space="preserve"># 3. Stop the preview (press Ctrl+C)</w:t>
+              <w:t xml:space="preserve"># 2. Start a local preview (optional)</w:t>
             </w:r>
           </w:p>
         </w:tc>
@@ -7755,7 +8348,7 @@
                 <w:sz w:val="18"/>
                 <w:szCs w:val="18"/>
               </w:rPr>
-              <w:t xml:space="preserve"/>
+              <w:t xml:space="preserve">npm run dev</w:t>
             </w:r>
           </w:p>
         </w:tc>
@@ -7805,7 +8398,7 @@
                 <w:sz w:val="18"/>
                 <w:szCs w:val="18"/>
               </w:rPr>
-              <w:t xml:space="preserve"># 4. Stage, commit and push</w:t>
+              <w:t xml:space="preserve"/>
             </w:r>
           </w:p>
         </w:tc>
@@ -7855,7 +8448,7 @@
                 <w:sz w:val="18"/>
                 <w:szCs w:val="18"/>
               </w:rPr>
-              <w:t xml:space="preserve">git add .</w:t>
+              <w:t xml:space="preserve"># 3. Make your edits and save files in PyCharm</w:t>
             </w:r>
           </w:p>
         </w:tc>
@@ -7905,7 +8498,7 @@
                 <w:sz w:val="18"/>
                 <w:szCs w:val="18"/>
               </w:rPr>
-              <w:t xml:space="preserve">git commit -m "Added two new Google reviews"</w:t>
+              <w:t xml:space="preserve"/>
             </w:r>
           </w:p>
         </w:tc>
@@ -7955,7 +8548,757 @@
                 <w:sz w:val="18"/>
                 <w:szCs w:val="18"/>
               </w:rPr>
-              <w:t xml:space="preserve">git push</w:t>
+              <w:t xml:space="preserve"># 4. Stop the local preview (press Ctrl+C)</w:t>
+            </w:r>
+          </w:p>
+        </w:tc>
+      </w:tr>
+    </w:tbl>
+    <w:tbl>
+      <w:tblPr>
+        <w:tblW w:type="dxa" w:w="9360"/>
+        <w:tblBorders>
+          <w:top w:val="single" w:color="auto" w:sz="4"/>
+          <w:left w:val="single" w:color="auto" w:sz="4"/>
+          <w:bottom w:val="single" w:color="auto" w:sz="4"/>
+          <w:right w:val="single" w:color="auto" w:sz="4"/>
+          <w:insideH w:val="single" w:color="auto" w:sz="4"/>
+          <w:insideV w:val="single" w:color="auto" w:sz="4"/>
+        </w:tblBorders>
+      </w:tblPr>
+      <w:tblGrid>
+        <w:gridCol w:w="9360"/>
+      </w:tblGrid>
+      <w:tr>
+        <w:tc>
+          <w:tcPr>
+            <w:tcBorders>
+              <w:top w:val="single" w:color="cbd5e1" w:sz="1"/>
+              <w:left w:val="single" w:color="cbd5e1" w:sz="1"/>
+              <w:bottom w:val="single" w:color="cbd5e1" w:sz="1"/>
+              <w:right w:val="single" w:color="cbd5e1" w:sz="1"/>
+            </w:tcBorders>
+            <w:shd w:fill="f1f5f9" w:val="clear"/>
+            <w:tcMar>
+              <w:top w:type="dxa" w:w="100"/>
+              <w:left w:type="dxa" w:w="150"/>
+              <w:bottom w:type="dxa" w:w="100"/>
+              <w:right w:type="dxa" w:w="150"/>
+            </w:tcMar>
+            <w:vAlign w:val="top"/>
+          </w:tcPr>
+          <w:p>
+            <w:pPr>
+              <w:spacing w:after="60" w:before="0"/>
+            </w:pPr>
+            <w:r>
+              <w:rPr>
+                <w:rFonts w:ascii="Courier New" w:cs="Courier New" w:eastAsia="Courier New" w:hAnsi="Courier New"/>
+                <w:color w:val="1e40af"/>
+                <w:sz w:val="18"/>
+                <w:szCs w:val="18"/>
+              </w:rPr>
+              <w:t xml:space="preserve"/>
+            </w:r>
+          </w:p>
+        </w:tc>
+      </w:tr>
+    </w:tbl>
+    <w:tbl>
+      <w:tblPr>
+        <w:tblW w:type="dxa" w:w="9360"/>
+        <w:tblBorders>
+          <w:top w:val="single" w:color="auto" w:sz="4"/>
+          <w:left w:val="single" w:color="auto" w:sz="4"/>
+          <w:bottom w:val="single" w:color="auto" w:sz="4"/>
+          <w:right w:val="single" w:color="auto" w:sz="4"/>
+          <w:insideH w:val="single" w:color="auto" w:sz="4"/>
+          <w:insideV w:val="single" w:color="auto" w:sz="4"/>
+        </w:tblBorders>
+      </w:tblPr>
+      <w:tblGrid>
+        <w:gridCol w:w="9360"/>
+      </w:tblGrid>
+      <w:tr>
+        <w:tc>
+          <w:tcPr>
+            <w:tcBorders>
+              <w:top w:val="single" w:color="cbd5e1" w:sz="1"/>
+              <w:left w:val="single" w:color="cbd5e1" w:sz="1"/>
+              <w:bottom w:val="single" w:color="cbd5e1" w:sz="1"/>
+              <w:right w:val="single" w:color="cbd5e1" w:sz="1"/>
+            </w:tcBorders>
+            <w:shd w:fill="f1f5f9" w:val="clear"/>
+            <w:tcMar>
+              <w:top w:type="dxa" w:w="100"/>
+              <w:left w:type="dxa" w:w="150"/>
+              <w:bottom w:type="dxa" w:w="100"/>
+              <w:right w:type="dxa" w:w="150"/>
+            </w:tcMar>
+            <w:vAlign w:val="top"/>
+          </w:tcPr>
+          <w:p>
+            <w:pPr>
+              <w:spacing w:after="60" w:before="0"/>
+            </w:pPr>
+            <w:r>
+              <w:rPr>
+                <w:rFonts w:ascii="Courier New" w:cs="Courier New" w:eastAsia="Courier New" w:hAnsi="Courier New"/>
+                <w:color w:val="1e40af"/>
+                <w:sz w:val="18"/>
+                <w:szCs w:val="18"/>
+              </w:rPr>
+              <w:t xml:space="preserve"># 5. Stage and commit your changes</w:t>
+            </w:r>
+          </w:p>
+        </w:tc>
+      </w:tr>
+    </w:tbl>
+    <w:tbl>
+      <w:tblPr>
+        <w:tblW w:type="dxa" w:w="9360"/>
+        <w:tblBorders>
+          <w:top w:val="single" w:color="auto" w:sz="4"/>
+          <w:left w:val="single" w:color="auto" w:sz="4"/>
+          <w:bottom w:val="single" w:color="auto" w:sz="4"/>
+          <w:right w:val="single" w:color="auto" w:sz="4"/>
+          <w:insideH w:val="single" w:color="auto" w:sz="4"/>
+          <w:insideV w:val="single" w:color="auto" w:sz="4"/>
+        </w:tblBorders>
+      </w:tblPr>
+      <w:tblGrid>
+        <w:gridCol w:w="9360"/>
+      </w:tblGrid>
+      <w:tr>
+        <w:tc>
+          <w:tcPr>
+            <w:tcBorders>
+              <w:top w:val="single" w:color="cbd5e1" w:sz="1"/>
+              <w:left w:val="single" w:color="cbd5e1" w:sz="1"/>
+              <w:bottom w:val="single" w:color="cbd5e1" w:sz="1"/>
+              <w:right w:val="single" w:color="cbd5e1" w:sz="1"/>
+            </w:tcBorders>
+            <w:shd w:fill="f1f5f9" w:val="clear"/>
+            <w:tcMar>
+              <w:top w:type="dxa" w:w="100"/>
+              <w:left w:type="dxa" w:w="150"/>
+              <w:bottom w:type="dxa" w:w="100"/>
+              <w:right w:type="dxa" w:w="150"/>
+            </w:tcMar>
+            <w:vAlign w:val="top"/>
+          </w:tcPr>
+          <w:p>
+            <w:pPr>
+              <w:spacing w:after="60" w:before="0"/>
+            </w:pPr>
+            <w:r>
+              <w:rPr>
+                <w:rFonts w:ascii="Courier New" w:cs="Courier New" w:eastAsia="Courier New" w:hAnsi="Courier New"/>
+                <w:color w:val="1e40af"/>
+                <w:sz w:val="18"/>
+                <w:szCs w:val="18"/>
+              </w:rPr>
+              <w:t xml:space="preserve">git add .</w:t>
+            </w:r>
+          </w:p>
+        </w:tc>
+      </w:tr>
+    </w:tbl>
+    <w:tbl>
+      <w:tblPr>
+        <w:tblW w:type="dxa" w:w="9360"/>
+        <w:tblBorders>
+          <w:top w:val="single" w:color="auto" w:sz="4"/>
+          <w:left w:val="single" w:color="auto" w:sz="4"/>
+          <w:bottom w:val="single" w:color="auto" w:sz="4"/>
+          <w:right w:val="single" w:color="auto" w:sz="4"/>
+          <w:insideH w:val="single" w:color="auto" w:sz="4"/>
+          <w:insideV w:val="single" w:color="auto" w:sz="4"/>
+        </w:tblBorders>
+      </w:tblPr>
+      <w:tblGrid>
+        <w:gridCol w:w="9360"/>
+      </w:tblGrid>
+      <w:tr>
+        <w:tc>
+          <w:tcPr>
+            <w:tcBorders>
+              <w:top w:val="single" w:color="cbd5e1" w:sz="1"/>
+              <w:left w:val="single" w:color="cbd5e1" w:sz="1"/>
+              <w:bottom w:val="single" w:color="cbd5e1" w:sz="1"/>
+              <w:right w:val="single" w:color="cbd5e1" w:sz="1"/>
+            </w:tcBorders>
+            <w:shd w:fill="f1f5f9" w:val="clear"/>
+            <w:tcMar>
+              <w:top w:type="dxa" w:w="100"/>
+              <w:left w:type="dxa" w:w="150"/>
+              <w:bottom w:type="dxa" w:w="100"/>
+              <w:right w:type="dxa" w:w="150"/>
+            </w:tcMar>
+            <w:vAlign w:val="top"/>
+          </w:tcPr>
+          <w:p>
+            <w:pPr>
+              <w:spacing w:after="60" w:before="0"/>
+            </w:pPr>
+            <w:r>
+              <w:rPr>
+                <w:rFonts w:ascii="Courier New" w:cs="Courier New" w:eastAsia="Courier New" w:hAnsi="Courier New"/>
+                <w:color w:val="1e40af"/>
+                <w:sz w:val="18"/>
+                <w:szCs w:val="18"/>
+              </w:rPr>
+              <w:t xml:space="preserve">git commit -m "Added two new Google reviews"</w:t>
+            </w:r>
+          </w:p>
+        </w:tc>
+      </w:tr>
+    </w:tbl>
+    <w:tbl>
+      <w:tblPr>
+        <w:tblW w:type="dxa" w:w="9360"/>
+        <w:tblBorders>
+          <w:top w:val="single" w:color="auto" w:sz="4"/>
+          <w:left w:val="single" w:color="auto" w:sz="4"/>
+          <w:bottom w:val="single" w:color="auto" w:sz="4"/>
+          <w:right w:val="single" w:color="auto" w:sz="4"/>
+          <w:insideH w:val="single" w:color="auto" w:sz="4"/>
+          <w:insideV w:val="single" w:color="auto" w:sz="4"/>
+        </w:tblBorders>
+      </w:tblPr>
+      <w:tblGrid>
+        <w:gridCol w:w="9360"/>
+      </w:tblGrid>
+      <w:tr>
+        <w:tc>
+          <w:tcPr>
+            <w:tcBorders>
+              <w:top w:val="single" w:color="cbd5e1" w:sz="1"/>
+              <w:left w:val="single" w:color="cbd5e1" w:sz="1"/>
+              <w:bottom w:val="single" w:color="cbd5e1" w:sz="1"/>
+              <w:right w:val="single" w:color="cbd5e1" w:sz="1"/>
+            </w:tcBorders>
+            <w:shd w:fill="f1f5f9" w:val="clear"/>
+            <w:tcMar>
+              <w:top w:type="dxa" w:w="100"/>
+              <w:left w:type="dxa" w:w="150"/>
+              <w:bottom w:type="dxa" w:w="100"/>
+              <w:right w:type="dxa" w:w="150"/>
+            </w:tcMar>
+            <w:vAlign w:val="top"/>
+          </w:tcPr>
+          <w:p>
+            <w:pPr>
+              <w:spacing w:after="60" w:before="0"/>
+            </w:pPr>
+            <w:r>
+              <w:rPr>
+                <w:rFonts w:ascii="Courier New" w:cs="Courier New" w:eastAsia="Courier New" w:hAnsi="Courier New"/>
+                <w:color w:val="1e40af"/>
+                <w:sz w:val="18"/>
+                <w:szCs w:val="18"/>
+              </w:rPr>
+              <w:t xml:space="preserve"/>
+            </w:r>
+          </w:p>
+        </w:tc>
+      </w:tr>
+    </w:tbl>
+    <w:tbl>
+      <w:tblPr>
+        <w:tblW w:type="dxa" w:w="9360"/>
+        <w:tblBorders>
+          <w:top w:val="single" w:color="auto" w:sz="4"/>
+          <w:left w:val="single" w:color="auto" w:sz="4"/>
+          <w:bottom w:val="single" w:color="auto" w:sz="4"/>
+          <w:right w:val="single" w:color="auto" w:sz="4"/>
+          <w:insideH w:val="single" w:color="auto" w:sz="4"/>
+          <w:insideV w:val="single" w:color="auto" w:sz="4"/>
+        </w:tblBorders>
+      </w:tblPr>
+      <w:tblGrid>
+        <w:gridCol w:w="9360"/>
+      </w:tblGrid>
+      <w:tr>
+        <w:tc>
+          <w:tcPr>
+            <w:tcBorders>
+              <w:top w:val="single" w:color="cbd5e1" w:sz="1"/>
+              <w:left w:val="single" w:color="cbd5e1" w:sz="1"/>
+              <w:bottom w:val="single" w:color="cbd5e1" w:sz="1"/>
+              <w:right w:val="single" w:color="cbd5e1" w:sz="1"/>
+            </w:tcBorders>
+            <w:shd w:fill="f1f5f9" w:val="clear"/>
+            <w:tcMar>
+              <w:top w:type="dxa" w:w="100"/>
+              <w:left w:type="dxa" w:w="150"/>
+              <w:bottom w:type="dxa" w:w="100"/>
+              <w:right w:type="dxa" w:w="150"/>
+            </w:tcMar>
+            <w:vAlign w:val="top"/>
+          </w:tcPr>
+          <w:p>
+            <w:pPr>
+              <w:spacing w:after="60" w:before="0"/>
+            </w:pPr>
+            <w:r>
+              <w:rPr>
+                <w:rFonts w:ascii="Courier New" w:cs="Courier New" w:eastAsia="Courier New" w:hAnsi="Courier New"/>
+                <w:color w:val="1e40af"/>
+                <w:sz w:val="18"/>
+                <w:szCs w:val="18"/>
+              </w:rPr>
+              <w:t xml:space="preserve"># 6. Push to staging and check the Cloudflare preview URL</w:t>
+            </w:r>
+          </w:p>
+        </w:tc>
+      </w:tr>
+    </w:tbl>
+    <w:tbl>
+      <w:tblPr>
+        <w:tblW w:type="dxa" w:w="9360"/>
+        <w:tblBorders>
+          <w:top w:val="single" w:color="auto" w:sz="4"/>
+          <w:left w:val="single" w:color="auto" w:sz="4"/>
+          <w:bottom w:val="single" w:color="auto" w:sz="4"/>
+          <w:right w:val="single" w:color="auto" w:sz="4"/>
+          <w:insideH w:val="single" w:color="auto" w:sz="4"/>
+          <w:insideV w:val="single" w:color="auto" w:sz="4"/>
+        </w:tblBorders>
+      </w:tblPr>
+      <w:tblGrid>
+        <w:gridCol w:w="9360"/>
+      </w:tblGrid>
+      <w:tr>
+        <w:tc>
+          <w:tcPr>
+            <w:tcBorders>
+              <w:top w:val="single" w:color="cbd5e1" w:sz="1"/>
+              <w:left w:val="single" w:color="cbd5e1" w:sz="1"/>
+              <w:bottom w:val="single" w:color="cbd5e1" w:sz="1"/>
+              <w:right w:val="single" w:color="cbd5e1" w:sz="1"/>
+            </w:tcBorders>
+            <w:shd w:fill="f1f5f9" w:val="clear"/>
+            <w:tcMar>
+              <w:top w:type="dxa" w:w="100"/>
+              <w:left w:type="dxa" w:w="150"/>
+              <w:bottom w:type="dxa" w:w="100"/>
+              <w:right w:type="dxa" w:w="150"/>
+            </w:tcMar>
+            <w:vAlign w:val="top"/>
+          </w:tcPr>
+          <w:p>
+            <w:pPr>
+              <w:spacing w:after="60" w:before="0"/>
+            </w:pPr>
+            <w:r>
+              <w:rPr>
+                <w:rFonts w:ascii="Courier New" w:cs="Courier New" w:eastAsia="Courier New" w:hAnsi="Courier New"/>
+                <w:color w:val="1e40af"/>
+                <w:sz w:val="18"/>
+                <w:szCs w:val="18"/>
+              </w:rPr>
+              <w:t xml:space="preserve">git push origin staging</w:t>
+            </w:r>
+          </w:p>
+        </w:tc>
+      </w:tr>
+    </w:tbl>
+    <w:tbl>
+      <w:tblPr>
+        <w:tblW w:type="dxa" w:w="9360"/>
+        <w:tblBorders>
+          <w:top w:val="single" w:color="auto" w:sz="4"/>
+          <w:left w:val="single" w:color="auto" w:sz="4"/>
+          <w:bottom w:val="single" w:color="auto" w:sz="4"/>
+          <w:right w:val="single" w:color="auto" w:sz="4"/>
+          <w:insideH w:val="single" w:color="auto" w:sz="4"/>
+          <w:insideV w:val="single" w:color="auto" w:sz="4"/>
+        </w:tblBorders>
+      </w:tblPr>
+      <w:tblGrid>
+        <w:gridCol w:w="9360"/>
+      </w:tblGrid>
+      <w:tr>
+        <w:tc>
+          <w:tcPr>
+            <w:tcBorders>
+              <w:top w:val="single" w:color="cbd5e1" w:sz="1"/>
+              <w:left w:val="single" w:color="cbd5e1" w:sz="1"/>
+              <w:bottom w:val="single" w:color="cbd5e1" w:sz="1"/>
+              <w:right w:val="single" w:color="cbd5e1" w:sz="1"/>
+            </w:tcBorders>
+            <w:shd w:fill="f1f5f9" w:val="clear"/>
+            <w:tcMar>
+              <w:top w:type="dxa" w:w="100"/>
+              <w:left w:type="dxa" w:w="150"/>
+              <w:bottom w:type="dxa" w:w="100"/>
+              <w:right w:type="dxa" w:w="150"/>
+            </w:tcMar>
+            <w:vAlign w:val="top"/>
+          </w:tcPr>
+          <w:p>
+            <w:pPr>
+              <w:spacing w:after="60" w:before="0"/>
+            </w:pPr>
+            <w:r>
+              <w:rPr>
+                <w:rFonts w:ascii="Courier New" w:cs="Courier New" w:eastAsia="Courier New" w:hAnsi="Courier New"/>
+                <w:color w:val="1e40af"/>
+                <w:sz w:val="18"/>
+                <w:szCs w:val="18"/>
+              </w:rPr>
+              <w:t xml:space="preserve"/>
+            </w:r>
+          </w:p>
+        </w:tc>
+      </w:tr>
+    </w:tbl>
+    <w:tbl>
+      <w:tblPr>
+        <w:tblW w:type="dxa" w:w="9360"/>
+        <w:tblBorders>
+          <w:top w:val="single" w:color="auto" w:sz="4"/>
+          <w:left w:val="single" w:color="auto" w:sz="4"/>
+          <w:bottom w:val="single" w:color="auto" w:sz="4"/>
+          <w:right w:val="single" w:color="auto" w:sz="4"/>
+          <w:insideH w:val="single" w:color="auto" w:sz="4"/>
+          <w:insideV w:val="single" w:color="auto" w:sz="4"/>
+        </w:tblBorders>
+      </w:tblPr>
+      <w:tblGrid>
+        <w:gridCol w:w="9360"/>
+      </w:tblGrid>
+      <w:tr>
+        <w:tc>
+          <w:tcPr>
+            <w:tcBorders>
+              <w:top w:val="single" w:color="cbd5e1" w:sz="1"/>
+              <w:left w:val="single" w:color="cbd5e1" w:sz="1"/>
+              <w:bottom w:val="single" w:color="cbd5e1" w:sz="1"/>
+              <w:right w:val="single" w:color="cbd5e1" w:sz="1"/>
+            </w:tcBorders>
+            <w:shd w:fill="f1f5f9" w:val="clear"/>
+            <w:tcMar>
+              <w:top w:type="dxa" w:w="100"/>
+              <w:left w:type="dxa" w:w="150"/>
+              <w:bottom w:type="dxa" w:w="100"/>
+              <w:right w:type="dxa" w:w="150"/>
+            </w:tcMar>
+            <w:vAlign w:val="top"/>
+          </w:tcPr>
+          <w:p>
+            <w:pPr>
+              <w:spacing w:after="60" w:before="0"/>
+            </w:pPr>
+            <w:r>
+              <w:rPr>
+                <w:rFonts w:ascii="Courier New" w:cs="Courier New" w:eastAsia="Courier New" w:hAnsi="Courier New"/>
+                <w:color w:val="1e40af"/>
+                <w:sz w:val="18"/>
+                <w:szCs w:val="18"/>
+              </w:rPr>
+              <w:t xml:space="preserve"># 7. When happy, merge to main to go live</w:t>
+            </w:r>
+          </w:p>
+        </w:tc>
+      </w:tr>
+    </w:tbl>
+    <w:tbl>
+      <w:tblPr>
+        <w:tblW w:type="dxa" w:w="9360"/>
+        <w:tblBorders>
+          <w:top w:val="single" w:color="auto" w:sz="4"/>
+          <w:left w:val="single" w:color="auto" w:sz="4"/>
+          <w:bottom w:val="single" w:color="auto" w:sz="4"/>
+          <w:right w:val="single" w:color="auto" w:sz="4"/>
+          <w:insideH w:val="single" w:color="auto" w:sz="4"/>
+          <w:insideV w:val="single" w:color="auto" w:sz="4"/>
+        </w:tblBorders>
+      </w:tblPr>
+      <w:tblGrid>
+        <w:gridCol w:w="9360"/>
+      </w:tblGrid>
+      <w:tr>
+        <w:tc>
+          <w:tcPr>
+            <w:tcBorders>
+              <w:top w:val="single" w:color="cbd5e1" w:sz="1"/>
+              <w:left w:val="single" w:color="cbd5e1" w:sz="1"/>
+              <w:bottom w:val="single" w:color="cbd5e1" w:sz="1"/>
+              <w:right w:val="single" w:color="cbd5e1" w:sz="1"/>
+            </w:tcBorders>
+            <w:shd w:fill="f1f5f9" w:val="clear"/>
+            <w:tcMar>
+              <w:top w:type="dxa" w:w="100"/>
+              <w:left w:type="dxa" w:w="150"/>
+              <w:bottom w:type="dxa" w:w="100"/>
+              <w:right w:type="dxa" w:w="150"/>
+            </w:tcMar>
+            <w:vAlign w:val="top"/>
+          </w:tcPr>
+          <w:p>
+            <w:pPr>
+              <w:spacing w:after="60" w:before="0"/>
+            </w:pPr>
+            <w:r>
+              <w:rPr>
+                <w:rFonts w:ascii="Courier New" w:cs="Courier New" w:eastAsia="Courier New" w:hAnsi="Courier New"/>
+                <w:color w:val="1e40af"/>
+                <w:sz w:val="18"/>
+                <w:szCs w:val="18"/>
+              </w:rPr>
+              <w:t xml:space="preserve">git checkout main</w:t>
+            </w:r>
+          </w:p>
+        </w:tc>
+      </w:tr>
+    </w:tbl>
+    <w:tbl>
+      <w:tblPr>
+        <w:tblW w:type="dxa" w:w="9360"/>
+        <w:tblBorders>
+          <w:top w:val="single" w:color="auto" w:sz="4"/>
+          <w:left w:val="single" w:color="auto" w:sz="4"/>
+          <w:bottom w:val="single" w:color="auto" w:sz="4"/>
+          <w:right w:val="single" w:color="auto" w:sz="4"/>
+          <w:insideH w:val="single" w:color="auto" w:sz="4"/>
+          <w:insideV w:val="single" w:color="auto" w:sz="4"/>
+        </w:tblBorders>
+      </w:tblPr>
+      <w:tblGrid>
+        <w:gridCol w:w="9360"/>
+      </w:tblGrid>
+      <w:tr>
+        <w:tc>
+          <w:tcPr>
+            <w:tcBorders>
+              <w:top w:val="single" w:color="cbd5e1" w:sz="1"/>
+              <w:left w:val="single" w:color="cbd5e1" w:sz="1"/>
+              <w:bottom w:val="single" w:color="cbd5e1" w:sz="1"/>
+              <w:right w:val="single" w:color="cbd5e1" w:sz="1"/>
+            </w:tcBorders>
+            <w:shd w:fill="f1f5f9" w:val="clear"/>
+            <w:tcMar>
+              <w:top w:type="dxa" w:w="100"/>
+              <w:left w:type="dxa" w:w="150"/>
+              <w:bottom w:type="dxa" w:w="100"/>
+              <w:right w:type="dxa" w:w="150"/>
+            </w:tcMar>
+            <w:vAlign w:val="top"/>
+          </w:tcPr>
+          <w:p>
+            <w:pPr>
+              <w:spacing w:after="60" w:before="0"/>
+            </w:pPr>
+            <w:r>
+              <w:rPr>
+                <w:rFonts w:ascii="Courier New" w:cs="Courier New" w:eastAsia="Courier New" w:hAnsi="Courier New"/>
+                <w:color w:val="1e40af"/>
+                <w:sz w:val="18"/>
+                <w:szCs w:val="18"/>
+              </w:rPr>
+              <w:t xml:space="preserve">git merge staging</w:t>
+            </w:r>
+          </w:p>
+        </w:tc>
+      </w:tr>
+    </w:tbl>
+    <w:tbl>
+      <w:tblPr>
+        <w:tblW w:type="dxa" w:w="9360"/>
+        <w:tblBorders>
+          <w:top w:val="single" w:color="auto" w:sz="4"/>
+          <w:left w:val="single" w:color="auto" w:sz="4"/>
+          <w:bottom w:val="single" w:color="auto" w:sz="4"/>
+          <w:right w:val="single" w:color="auto" w:sz="4"/>
+          <w:insideH w:val="single" w:color="auto" w:sz="4"/>
+          <w:insideV w:val="single" w:color="auto" w:sz="4"/>
+        </w:tblBorders>
+      </w:tblPr>
+      <w:tblGrid>
+        <w:gridCol w:w="9360"/>
+      </w:tblGrid>
+      <w:tr>
+        <w:tc>
+          <w:tcPr>
+            <w:tcBorders>
+              <w:top w:val="single" w:color="cbd5e1" w:sz="1"/>
+              <w:left w:val="single" w:color="cbd5e1" w:sz="1"/>
+              <w:bottom w:val="single" w:color="cbd5e1" w:sz="1"/>
+              <w:right w:val="single" w:color="cbd5e1" w:sz="1"/>
+            </w:tcBorders>
+            <w:shd w:fill="f1f5f9" w:val="clear"/>
+            <w:tcMar>
+              <w:top w:type="dxa" w:w="100"/>
+              <w:left w:type="dxa" w:w="150"/>
+              <w:bottom w:type="dxa" w:w="100"/>
+              <w:right w:type="dxa" w:w="150"/>
+            </w:tcMar>
+            <w:vAlign w:val="top"/>
+          </w:tcPr>
+          <w:p>
+            <w:pPr>
+              <w:spacing w:after="60" w:before="0"/>
+            </w:pPr>
+            <w:r>
+              <w:rPr>
+                <w:rFonts w:ascii="Courier New" w:cs="Courier New" w:eastAsia="Courier New" w:hAnsi="Courier New"/>
+                <w:color w:val="1e40af"/>
+                <w:sz w:val="18"/>
+                <w:szCs w:val="18"/>
+              </w:rPr>
+              <w:t xml:space="preserve">git push origin main</w:t>
+            </w:r>
+          </w:p>
+        </w:tc>
+      </w:tr>
+    </w:tbl>
+    <w:tbl>
+      <w:tblPr>
+        <w:tblW w:type="dxa" w:w="9360"/>
+        <w:tblBorders>
+          <w:top w:val="single" w:color="auto" w:sz="4"/>
+          <w:left w:val="single" w:color="auto" w:sz="4"/>
+          <w:bottom w:val="single" w:color="auto" w:sz="4"/>
+          <w:right w:val="single" w:color="auto" w:sz="4"/>
+          <w:insideH w:val="single" w:color="auto" w:sz="4"/>
+          <w:insideV w:val="single" w:color="auto" w:sz="4"/>
+        </w:tblBorders>
+      </w:tblPr>
+      <w:tblGrid>
+        <w:gridCol w:w="9360"/>
+      </w:tblGrid>
+      <w:tr>
+        <w:tc>
+          <w:tcPr>
+            <w:tcBorders>
+              <w:top w:val="single" w:color="cbd5e1" w:sz="1"/>
+              <w:left w:val="single" w:color="cbd5e1" w:sz="1"/>
+              <w:bottom w:val="single" w:color="cbd5e1" w:sz="1"/>
+              <w:right w:val="single" w:color="cbd5e1" w:sz="1"/>
+            </w:tcBorders>
+            <w:shd w:fill="f1f5f9" w:val="clear"/>
+            <w:tcMar>
+              <w:top w:type="dxa" w:w="100"/>
+              <w:left w:type="dxa" w:w="150"/>
+              <w:bottom w:type="dxa" w:w="100"/>
+              <w:right w:type="dxa" w:w="150"/>
+            </w:tcMar>
+            <w:vAlign w:val="top"/>
+          </w:tcPr>
+          <w:p>
+            <w:pPr>
+              <w:spacing w:after="60" w:before="0"/>
+            </w:pPr>
+            <w:r>
+              <w:rPr>
+                <w:rFonts w:ascii="Courier New" w:cs="Courier New" w:eastAsia="Courier New" w:hAnsi="Courier New"/>
+                <w:color w:val="1e40af"/>
+                <w:sz w:val="18"/>
+                <w:szCs w:val="18"/>
+              </w:rPr>
+              <w:t xml:space="preserve"/>
+            </w:r>
+          </w:p>
+        </w:tc>
+      </w:tr>
+    </w:tbl>
+    <w:tbl>
+      <w:tblPr>
+        <w:tblW w:type="dxa" w:w="9360"/>
+        <w:tblBorders>
+          <w:top w:val="single" w:color="auto" w:sz="4"/>
+          <w:left w:val="single" w:color="auto" w:sz="4"/>
+          <w:bottom w:val="single" w:color="auto" w:sz="4"/>
+          <w:right w:val="single" w:color="auto" w:sz="4"/>
+          <w:insideH w:val="single" w:color="auto" w:sz="4"/>
+          <w:insideV w:val="single" w:color="auto" w:sz="4"/>
+        </w:tblBorders>
+      </w:tblPr>
+      <w:tblGrid>
+        <w:gridCol w:w="9360"/>
+      </w:tblGrid>
+      <w:tr>
+        <w:tc>
+          <w:tcPr>
+            <w:tcBorders>
+              <w:top w:val="single" w:color="cbd5e1" w:sz="1"/>
+              <w:left w:val="single" w:color="cbd5e1" w:sz="1"/>
+              <w:bottom w:val="single" w:color="cbd5e1" w:sz="1"/>
+              <w:right w:val="single" w:color="cbd5e1" w:sz="1"/>
+            </w:tcBorders>
+            <w:shd w:fill="f1f5f9" w:val="clear"/>
+            <w:tcMar>
+              <w:top w:type="dxa" w:w="100"/>
+              <w:left w:type="dxa" w:w="150"/>
+              <w:bottom w:type="dxa" w:w="100"/>
+              <w:right w:type="dxa" w:w="150"/>
+            </w:tcMar>
+            <w:vAlign w:val="top"/>
+          </w:tcPr>
+          <w:p>
+            <w:pPr>
+              <w:spacing w:after="60" w:before="0"/>
+            </w:pPr>
+            <w:r>
+              <w:rPr>
+                <w:rFonts w:ascii="Courier New" w:cs="Courier New" w:eastAsia="Courier New" w:hAnsi="Courier New"/>
+                <w:color w:val="1e40af"/>
+                <w:sz w:val="18"/>
+                <w:szCs w:val="18"/>
+              </w:rPr>
+              <w:t xml:space="preserve"># 8. Switch back to staging for your next change</w:t>
+            </w:r>
+          </w:p>
+        </w:tc>
+      </w:tr>
+    </w:tbl>
+    <w:tbl>
+      <w:tblPr>
+        <w:tblW w:type="dxa" w:w="9360"/>
+        <w:tblBorders>
+          <w:top w:val="single" w:color="auto" w:sz="4"/>
+          <w:left w:val="single" w:color="auto" w:sz="4"/>
+          <w:bottom w:val="single" w:color="auto" w:sz="4"/>
+          <w:right w:val="single" w:color="auto" w:sz="4"/>
+          <w:insideH w:val="single" w:color="auto" w:sz="4"/>
+          <w:insideV w:val="single" w:color="auto" w:sz="4"/>
+        </w:tblBorders>
+      </w:tblPr>
+      <w:tblGrid>
+        <w:gridCol w:w="9360"/>
+      </w:tblGrid>
+      <w:tr>
+        <w:tc>
+          <w:tcPr>
+            <w:tcBorders>
+              <w:top w:val="single" w:color="cbd5e1" w:sz="1"/>
+              <w:left w:val="single" w:color="cbd5e1" w:sz="1"/>
+              <w:bottom w:val="single" w:color="cbd5e1" w:sz="1"/>
+              <w:right w:val="single" w:color="cbd5e1" w:sz="1"/>
+            </w:tcBorders>
+            <w:shd w:fill="f1f5f9" w:val="clear"/>
+            <w:tcMar>
+              <w:top w:type="dxa" w:w="100"/>
+              <w:left w:type="dxa" w:w="150"/>
+              <w:bottom w:type="dxa" w:w="100"/>
+              <w:right w:type="dxa" w:w="150"/>
+            </w:tcMar>
+            <w:vAlign w:val="top"/>
+          </w:tcPr>
+          <w:p>
+            <w:pPr>
+              <w:spacing w:after="60" w:before="0"/>
+            </w:pPr>
+            <w:r>
+              <w:rPr>
+                <w:rFonts w:ascii="Courier New" w:cs="Courier New" w:eastAsia="Courier New" w:hAnsi="Courier New"/>
+                <w:color w:val="1e40af"/>
+                <w:sz w:val="18"/>
+                <w:szCs w:val="18"/>
+              </w:rPr>
+              <w:t xml:space="preserve">git checkout staging</w:t>
             </w:r>
           </w:p>
         </w:tc>
@@ -9667,7 +11010,7 @@
                 <w:sz w:val="19"/>
                 <w:szCs w:val="19"/>
               </w:rPr>
-              <w:t xml:space="preserve">git add .</w:t>
+              <w:t xml:space="preserve">git checkout staging</w:t>
             </w:r>
           </w:p>
         </w:tc>
@@ -9703,7 +11046,7 @@
                 <w:sz w:val="19"/>
                 <w:szCs w:val="19"/>
               </w:rPr>
-              <w:t xml:space="preserve">Stage all changed files for saving</w:t>
+              <w:t xml:space="preserve">Switch to the staging branch (do this before editing)</w:t>
             </w:r>
           </w:p>
         </w:tc>
@@ -9737,10 +11080,10 @@
                 <w:b/>
                 <w:bCs/>
                 <w:color w:val="1e40af"/>
-                <w:sz w:val="18"/>
-                <w:szCs w:val="18"/>
-              </w:rPr>
-              <w:t xml:space="preserve">git commit -m "description"</w:t>
+                <w:sz w:val="19"/>
+                <w:szCs w:val="19"/>
+              </w:rPr>
+              <w:t xml:space="preserve">git add .</w:t>
             </w:r>
           </w:p>
         </w:tc>
@@ -9777,7 +11120,7 @@
                 <w:sz w:val="19"/>
                 <w:szCs w:val="19"/>
               </w:rPr>
-              <w:t xml:space="preserve">Save changes with a description</w:t>
+              <w:t xml:space="preserve">Stage all changed files for saving</w:t>
             </w:r>
           </w:p>
         </w:tc>
@@ -9810,10 +11153,10 @@
                 <w:b/>
                 <w:bCs/>
                 <w:color w:val="1e40af"/>
-                <w:sz w:val="19"/>
-                <w:szCs w:val="19"/>
-              </w:rPr>
-              <w:t xml:space="preserve">git push</w:t>
+                <w:sz w:val="18"/>
+                <w:szCs w:val="18"/>
+              </w:rPr>
+              <w:t xml:space="preserve">git commit -m "description"</w:t>
             </w:r>
           </w:p>
         </w:tc>
@@ -9849,7 +11192,7 @@
                 <w:sz w:val="19"/>
                 <w:szCs w:val="19"/>
               </w:rPr>
-              <w:t xml:space="preserve">Publish to the live website</w:t>
+              <w:t xml:space="preserve">Save changes with a description</w:t>
             </w:r>
           </w:p>
         </w:tc>
@@ -9883,10 +11226,10 @@
                 <w:b/>
                 <w:bCs/>
                 <w:color w:val="1e40af"/>
-                <w:sz w:val="19"/>
-                <w:szCs w:val="19"/>
-              </w:rPr>
-              <w:t xml:space="preserve">git diff</w:t>
+                <w:sz w:val="18"/>
+                <w:szCs w:val="18"/>
+              </w:rPr>
+              <w:t xml:space="preserve">git push origin staging</w:t>
             </w:r>
           </w:p>
         </w:tc>
@@ -9923,7 +11266,7 @@
                 <w:sz w:val="19"/>
                 <w:szCs w:val="19"/>
               </w:rPr>
-              <w:t xml:space="preserve">See what has changed since last save</w:t>
+              <w:t xml:space="preserve">Push to staging → triggers Cloudflare preview URL</w:t>
             </w:r>
           </w:p>
         </w:tc>
@@ -9959,7 +11302,7 @@
                 <w:sz w:val="19"/>
                 <w:szCs w:val="19"/>
               </w:rPr>
-              <w:t xml:space="preserve">git restore .</w:t>
+              <w:t xml:space="preserve">git checkout main</w:t>
             </w:r>
           </w:p>
         </w:tc>
@@ -9995,6 +11338,298 @@
                 <w:sz w:val="19"/>
                 <w:szCs w:val="19"/>
               </w:rPr>
+              <w:t xml:space="preserve">Switch to the main branch (before going live)</w:t>
+            </w:r>
+          </w:p>
+        </w:tc>
+      </w:tr>
+      <w:tr>
+        <w:tc>
+          <w:tcPr>
+            <w:tcW w:type="dxa" w:w="3600"/>
+            <w:tcBorders>
+              <w:top w:val="single" w:color="e5e7eb" w:sz="1"/>
+              <w:left w:val="single" w:color="e5e7eb" w:sz="1"/>
+              <w:bottom w:val="single" w:color="e5e7eb" w:sz="1"/>
+              <w:right w:val="single" w:color="e5e7eb" w:sz="1"/>
+            </w:tcBorders>
+            <w:shd w:fill="f9fafb" w:val="clear"/>
+            <w:tcMar>
+              <w:top w:type="dxa" w:w="100"/>
+              <w:left w:type="dxa" w:w="150"/>
+              <w:bottom w:type="dxa" w:w="100"/>
+              <w:right w:type="dxa" w:w="150"/>
+            </w:tcMar>
+            <w:vAlign w:val="top"/>
+          </w:tcPr>
+          <w:p>
+            <w:pPr>
+              <w:spacing w:after="0" w:before="0"/>
+            </w:pPr>
+            <w:r>
+              <w:rPr>
+                <w:rFonts w:ascii="Courier New" w:cs="Courier New" w:eastAsia="Courier New" w:hAnsi="Courier New"/>
+                <w:b/>
+                <w:bCs/>
+                <w:color w:val="1e40af"/>
+                <w:sz w:val="19"/>
+                <w:szCs w:val="19"/>
+              </w:rPr>
+              <w:t xml:space="preserve">git merge staging</w:t>
+            </w:r>
+          </w:p>
+        </w:tc>
+        <w:tc>
+          <w:tcPr>
+            <w:tcW w:type="dxa" w:w="5760"/>
+            <w:tcBorders>
+              <w:top w:val="single" w:color="e5e7eb" w:sz="1"/>
+              <w:left w:val="single" w:color="e5e7eb" w:sz="1"/>
+              <w:bottom w:val="single" w:color="e5e7eb" w:sz="1"/>
+              <w:right w:val="single" w:color="e5e7eb" w:sz="1"/>
+            </w:tcBorders>
+            <w:shd w:fill="f9fafb" w:val="clear"/>
+            <w:tcMar>
+              <w:top w:type="dxa" w:w="100"/>
+              <w:left w:type="dxa" w:w="150"/>
+              <w:bottom w:type="dxa" w:w="100"/>
+              <w:right w:type="dxa" w:w="150"/>
+            </w:tcMar>
+            <w:vAlign w:val="top"/>
+          </w:tcPr>
+          <w:p>
+            <w:pPr>
+              <w:spacing w:after="160" w:before="0"/>
+            </w:pPr>
+            <w:r>
+              <w:rPr>
+                <w:rFonts w:ascii="Arial" w:cs="Arial" w:eastAsia="Arial" w:hAnsi="Arial"/>
+                <w:b w:val="false"/>
+                <w:bCs w:val="false"/>
+                <w:i w:val="false"/>
+                <w:iCs w:val="false"/>
+                <w:color w:val="1f2937"/>
+                <w:sz w:val="19"/>
+                <w:szCs w:val="19"/>
+              </w:rPr>
+              <w:t xml:space="preserve">Merge staging changes into main</w:t>
+            </w:r>
+          </w:p>
+        </w:tc>
+      </w:tr>
+      <w:tr>
+        <w:tc>
+          <w:tcPr>
+            <w:tcW w:type="dxa" w:w="3600"/>
+            <w:tcBorders>
+              <w:top w:val="single" w:color="e5e7eb" w:sz="1"/>
+              <w:left w:val="single" w:color="e5e7eb" w:sz="1"/>
+              <w:bottom w:val="single" w:color="e5e7eb" w:sz="1"/>
+              <w:right w:val="single" w:color="e5e7eb" w:sz="1"/>
+            </w:tcBorders>
+            <w:tcMar>
+              <w:top w:type="dxa" w:w="100"/>
+              <w:left w:type="dxa" w:w="150"/>
+              <w:bottom w:type="dxa" w:w="100"/>
+              <w:right w:type="dxa" w:w="150"/>
+            </w:tcMar>
+            <w:vAlign w:val="top"/>
+          </w:tcPr>
+          <w:p>
+            <w:pPr>
+              <w:spacing w:after="0" w:before="0"/>
+            </w:pPr>
+            <w:r>
+              <w:rPr>
+                <w:rFonts w:ascii="Courier New" w:cs="Courier New" w:eastAsia="Courier New" w:hAnsi="Courier New"/>
+                <w:b/>
+                <w:bCs/>
+                <w:color w:val="1e40af"/>
+                <w:sz w:val="19"/>
+                <w:szCs w:val="19"/>
+              </w:rPr>
+              <w:t xml:space="preserve">git push origin main</w:t>
+            </w:r>
+          </w:p>
+        </w:tc>
+        <w:tc>
+          <w:tcPr>
+            <w:tcW w:type="dxa" w:w="5760"/>
+            <w:tcBorders>
+              <w:top w:val="single" w:color="e5e7eb" w:sz="1"/>
+              <w:left w:val="single" w:color="e5e7eb" w:sz="1"/>
+              <w:bottom w:val="single" w:color="e5e7eb" w:sz="1"/>
+              <w:right w:val="single" w:color="e5e7eb" w:sz="1"/>
+            </w:tcBorders>
+            <w:tcMar>
+              <w:top w:type="dxa" w:w="100"/>
+              <w:left w:type="dxa" w:w="150"/>
+              <w:bottom w:type="dxa" w:w="100"/>
+              <w:right w:type="dxa" w:w="150"/>
+            </w:tcMar>
+            <w:vAlign w:val="top"/>
+          </w:tcPr>
+          <w:p>
+            <w:pPr>
+              <w:spacing w:after="160" w:before="0"/>
+            </w:pPr>
+            <w:r>
+              <w:rPr>
+                <w:rFonts w:ascii="Arial" w:cs="Arial" w:eastAsia="Arial" w:hAnsi="Arial"/>
+                <w:b w:val="false"/>
+                <w:bCs w:val="false"/>
+                <w:i w:val="false"/>
+                <w:iCs w:val="false"/>
+                <w:color w:val="1f2937"/>
+                <w:sz w:val="19"/>
+                <w:szCs w:val="19"/>
+              </w:rPr>
+              <w:t xml:space="preserve">Publish to creatinglinks.org (goes live!)</w:t>
+            </w:r>
+          </w:p>
+        </w:tc>
+      </w:tr>
+      <w:tr>
+        <w:tc>
+          <w:tcPr>
+            <w:tcW w:type="dxa" w:w="3600"/>
+            <w:tcBorders>
+              <w:top w:val="single" w:color="e5e7eb" w:sz="1"/>
+              <w:left w:val="single" w:color="e5e7eb" w:sz="1"/>
+              <w:bottom w:val="single" w:color="e5e7eb" w:sz="1"/>
+              <w:right w:val="single" w:color="e5e7eb" w:sz="1"/>
+            </w:tcBorders>
+            <w:shd w:fill="f9fafb" w:val="clear"/>
+            <w:tcMar>
+              <w:top w:type="dxa" w:w="100"/>
+              <w:left w:type="dxa" w:w="150"/>
+              <w:bottom w:type="dxa" w:w="100"/>
+              <w:right w:type="dxa" w:w="150"/>
+            </w:tcMar>
+            <w:vAlign w:val="top"/>
+          </w:tcPr>
+          <w:p>
+            <w:pPr>
+              <w:spacing w:after="0" w:before="0"/>
+            </w:pPr>
+            <w:r>
+              <w:rPr>
+                <w:rFonts w:ascii="Courier New" w:cs="Courier New" w:eastAsia="Courier New" w:hAnsi="Courier New"/>
+                <w:b/>
+                <w:bCs/>
+                <w:color w:val="1e40af"/>
+                <w:sz w:val="19"/>
+                <w:szCs w:val="19"/>
+              </w:rPr>
+              <w:t xml:space="preserve">git diff</w:t>
+            </w:r>
+          </w:p>
+        </w:tc>
+        <w:tc>
+          <w:tcPr>
+            <w:tcW w:type="dxa" w:w="5760"/>
+            <w:tcBorders>
+              <w:top w:val="single" w:color="e5e7eb" w:sz="1"/>
+              <w:left w:val="single" w:color="e5e7eb" w:sz="1"/>
+              <w:bottom w:val="single" w:color="e5e7eb" w:sz="1"/>
+              <w:right w:val="single" w:color="e5e7eb" w:sz="1"/>
+            </w:tcBorders>
+            <w:shd w:fill="f9fafb" w:val="clear"/>
+            <w:tcMar>
+              <w:top w:type="dxa" w:w="100"/>
+              <w:left w:type="dxa" w:w="150"/>
+              <w:bottom w:type="dxa" w:w="100"/>
+              <w:right w:type="dxa" w:w="150"/>
+            </w:tcMar>
+            <w:vAlign w:val="top"/>
+          </w:tcPr>
+          <w:p>
+            <w:pPr>
+              <w:spacing w:after="160" w:before="0"/>
+            </w:pPr>
+            <w:r>
+              <w:rPr>
+                <w:rFonts w:ascii="Arial" w:cs="Arial" w:eastAsia="Arial" w:hAnsi="Arial"/>
+                <w:b w:val="false"/>
+                <w:bCs w:val="false"/>
+                <w:i w:val="false"/>
+                <w:iCs w:val="false"/>
+                <w:color w:val="1f2937"/>
+                <w:sz w:val="19"/>
+                <w:szCs w:val="19"/>
+              </w:rPr>
+              <w:t xml:space="preserve">See what has changed since last save</w:t>
+            </w:r>
+          </w:p>
+        </w:tc>
+      </w:tr>
+      <w:tr>
+        <w:tc>
+          <w:tcPr>
+            <w:tcW w:type="dxa" w:w="3600"/>
+            <w:tcBorders>
+              <w:top w:val="single" w:color="e5e7eb" w:sz="1"/>
+              <w:left w:val="single" w:color="e5e7eb" w:sz="1"/>
+              <w:bottom w:val="single" w:color="e5e7eb" w:sz="1"/>
+              <w:right w:val="single" w:color="e5e7eb" w:sz="1"/>
+            </w:tcBorders>
+            <w:tcMar>
+              <w:top w:type="dxa" w:w="100"/>
+              <w:left w:type="dxa" w:w="150"/>
+              <w:bottom w:type="dxa" w:w="100"/>
+              <w:right w:type="dxa" w:w="150"/>
+            </w:tcMar>
+            <w:vAlign w:val="top"/>
+          </w:tcPr>
+          <w:p>
+            <w:pPr>
+              <w:spacing w:after="0" w:before="0"/>
+            </w:pPr>
+            <w:r>
+              <w:rPr>
+                <w:rFonts w:ascii="Courier New" w:cs="Courier New" w:eastAsia="Courier New" w:hAnsi="Courier New"/>
+                <w:b/>
+                <w:bCs/>
+                <w:color w:val="1e40af"/>
+                <w:sz w:val="19"/>
+                <w:szCs w:val="19"/>
+              </w:rPr>
+              <w:t xml:space="preserve">git restore .</w:t>
+            </w:r>
+          </w:p>
+        </w:tc>
+        <w:tc>
+          <w:tcPr>
+            <w:tcW w:type="dxa" w:w="5760"/>
+            <w:tcBorders>
+              <w:top w:val="single" w:color="e5e7eb" w:sz="1"/>
+              <w:left w:val="single" w:color="e5e7eb" w:sz="1"/>
+              <w:bottom w:val="single" w:color="e5e7eb" w:sz="1"/>
+              <w:right w:val="single" w:color="e5e7eb" w:sz="1"/>
+            </w:tcBorders>
+            <w:tcMar>
+              <w:top w:type="dxa" w:w="100"/>
+              <w:left w:type="dxa" w:w="150"/>
+              <w:bottom w:type="dxa" w:w="100"/>
+              <w:right w:type="dxa" w:w="150"/>
+            </w:tcMar>
+            <w:vAlign w:val="top"/>
+          </w:tcPr>
+          <w:p>
+            <w:pPr>
+              <w:spacing w:after="160" w:before="0"/>
+            </w:pPr>
+            <w:r>
+              <w:rPr>
+                <w:rFonts w:ascii="Arial" w:cs="Arial" w:eastAsia="Arial" w:hAnsi="Arial"/>
+                <w:b w:val="false"/>
+                <w:bCs w:val="false"/>
+                <w:i w:val="false"/>
+                <w:iCs w:val="false"/>
+                <w:color w:val="1f2937"/>
+                <w:sz w:val="19"/>
+                <w:szCs w:val="19"/>
+              </w:rPr>
               <w:t xml:space="preserve">Undo all unsaved changes (use carefully!)</w:t>
             </w:r>
           </w:p>
@@ -10054,7 +11689,7 @@
           <w:sz w:val="20"/>
           <w:szCs w:val="20"/>
         </w:rPr>
-        <w:t xml:space="preserve">Always run npm run build before git push to catch errors early.</w:t>
+        <w:t xml:space="preserve">Always work on the staging branch. Run git checkout staging before making any edits.</w:t>
       </w:r>
     </w:p>
     <w:p>
@@ -10075,7 +11710,7 @@
           <w:sz w:val="20"/>
           <w:szCs w:val="20"/>
         </w:rPr>
-        <w:t xml:space="preserve">Never delete HTML tags like &lt;div&gt;, &lt;p&gt;, &lt;h1&gt; — only change the text inside them.</w:t>
+        <w:t xml:space="preserve">Never push changes directly to main — always push to staging first, review the preview URL, then merge to main.</w:t>
       </w:r>
     </w:p>
     <w:p>
@@ -10096,7 +11731,7 @@
           <w:sz w:val="20"/>
           <w:szCs w:val="20"/>
         </w:rPr>
-        <w:t xml:space="preserve">In JSON files, every item except the last one in a block needs a comma after it.</w:t>
+        <w:t xml:space="preserve">Always run npm run build before git push to catch errors early.</w:t>
       </w:r>
     </w:p>
     <w:p>
@@ -10117,7 +11752,7 @@
           <w:sz w:val="20"/>
           <w:szCs w:val="20"/>
         </w:rPr>
-        <w:t xml:space="preserve">Do not change the id field of any service — it will break the navigation links.</w:t>
+        <w:t xml:space="preserve">Never delete HTML tags like &lt;div&gt;, &lt;p&gt;, &lt;h1&gt; — only change the text inside them.</w:t>
       </w:r>
     </w:p>
     <w:p>
@@ -10138,7 +11773,49 @@
           <w:sz w:val="20"/>
           <w:szCs w:val="20"/>
         </w:rPr>
-        <w:t xml:space="preserve">After editing, always check the preview at localhost:4321 before publishing.</w:t>
+        <w:t xml:space="preserve">In JSON files, every item except the last one in a block needs a comma after it.</w:t>
+      </w:r>
+    </w:p>
+    <w:p>
+      <w:pPr>
+        <w:pStyle w:val="ListParagraph"/>
+        <w:numPr>
+          <w:ilvl w:val="0"/>
+          <w:numId w:val="3"/>
+        </w:numPr>
+        <w:spacing w:after="100" w:before="0"/>
+      </w:pPr>
+      <w:r>
+        <w:rPr>
+          <w:rFonts w:ascii="Arial" w:cs="Arial" w:eastAsia="Arial" w:hAnsi="Arial"/>
+          <w:b w:val="false"/>
+          <w:bCs w:val="false"/>
+          <w:color w:val="1f2937"/>
+          <w:sz w:val="20"/>
+          <w:szCs w:val="20"/>
+        </w:rPr>
+        <w:t xml:space="preserve">Do not change the id field of any service — it will break the navigation links.</w:t>
+      </w:r>
+    </w:p>
+    <w:p>
+      <w:pPr>
+        <w:pStyle w:val="ListParagraph"/>
+        <w:numPr>
+          <w:ilvl w:val="0"/>
+          <w:numId w:val="3"/>
+        </w:numPr>
+        <w:spacing w:after="100" w:before="0"/>
+      </w:pPr>
+      <w:r>
+        <w:rPr>
+          <w:rFonts w:ascii="Arial" w:cs="Arial" w:eastAsia="Arial" w:hAnsi="Arial"/>
+          <w:b w:val="false"/>
+          <w:bCs w:val="false"/>
+          <w:color w:val="1f2937"/>
+          <w:sz w:val="20"/>
+          <w:szCs w:val="20"/>
+        </w:rPr>
+        <w:t xml:space="preserve">After editing, always check the preview at localhost:4321 before pushing to staging.</w:t>
       </w:r>
     </w:p>
     <w:p>

</xml_diff>

<commit_message>
New Address and Location
</commit_message>
<xml_diff>
--- a/website-maintenance-guide.docx
+++ b/website-maintenance-guide.docx
@@ -500,7 +500,7 @@
             <w:pPr>
               <w:spacing w:after="0" w:before="0"/>
             </w:pPr>
-            <w:hyperlink w:history="1" r:id="rId6b4w2w5f6zanmjxdyod3o">
+            <w:hyperlink w:history="1" r:id="rIdmbaj2cso3pdpsanecd7mj">
               <w:r>
                 <w:rPr>
                   <w:rStyle w:val="Hyperlink"/>
@@ -628,7 +628,7 @@
             <w:pPr>
               <w:spacing w:after="0" w:before="0"/>
             </w:pPr>
-            <w:hyperlink w:history="1" r:id="rIdehvq3tzrmpakxak2pr_1s">
+            <w:hyperlink w:history="1" r:id="rIdu1ttguf9z3fyejzrui7r1">
               <w:r>
                 <w:rPr>
                   <w:rStyle w:val="Hyperlink"/>
@@ -753,7 +753,7 @@
             <w:pPr>
               <w:spacing w:after="0" w:before="0"/>
             </w:pPr>
-            <w:hyperlink w:history="1" r:id="rIdxl7bjrooksv2pgeirhnna">
+            <w:hyperlink w:history="1" r:id="rIdjxrjsviban2t0bcscrupl">
               <w:r>
                 <w:rPr>
                   <w:rStyle w:val="Hyperlink"/>
@@ -7796,7 +7796,42 @@
           <w:sz w:val="20"/>
           <w:szCs w:val="20"/>
         </w:rPr>
-        <w:t xml:space="preserve">Once the preview looks correct, run these commands to publish the changes to the live website:</w:t>
+        <w:t xml:space="preserve">Once the preview looks correct, run these five commands in order to publish the changes to the live website:</w:t>
+      </w:r>
+    </w:p>
+    <w:p>
+      <w:pPr>
+        <w:spacing w:after="160" w:before="0"/>
+      </w:pPr>
+      <w:r>
+        <w:rPr>
+          <w:rFonts w:ascii="Arial" w:cs="Arial" w:eastAsia="Arial" w:hAnsi="Arial"/>
+          <w:b w:val="false"/>
+          <w:bCs w:val="false"/>
+          <w:i w:val="false"/>
+          <w:iCs w:val="false"/>
+          <w:color w:val="1f2937"/>
+          <w:sz w:val="20"/>
+          <w:szCs w:val="20"/>
+        </w:rPr>
+        <w:t xml:space="preserve"/>
+      </w:r>
+    </w:p>
+    <w:p>
+      <w:pPr>
+        <w:pStyle w:val="Heading3"/>
+        <w:spacing w:after="120" w:before="240"/>
+      </w:pPr>
+      <w:r>
+        <w:rPr>
+          <w:rFonts w:ascii="Arial" w:cs="Arial" w:eastAsia="Arial" w:hAnsi="Arial"/>
+          <w:b/>
+          <w:bCs/>
+          <w:color w:val="1f2937"/>
+          <w:sz w:val="24"/>
+          <w:szCs w:val="24"/>
+        </w:rPr>
+        <w:t xml:space="preserve">First — commit everything on staging (required before switching branches)</w:t>
       </w:r>
     </w:p>
     <w:tbl>
@@ -7843,7 +7878,7 @@
                 <w:sz w:val="18"/>
                 <w:szCs w:val="18"/>
               </w:rPr>
-              <w:t xml:space="preserve">git checkout main</w:t>
+              <w:t xml:space="preserve">git add .</w:t>
             </w:r>
           </w:p>
         </w:tc>
@@ -7893,7 +7928,194 @@
                 <w:sz w:val="18"/>
                 <w:szCs w:val="18"/>
               </w:rPr>
-              <w:t xml:space="preserve">git merge staging</w:t>
+              <w:t xml:space="preserve">git commit -m "Ready to go live"</w:t>
+            </w:r>
+          </w:p>
+        </w:tc>
+      </w:tr>
+    </w:tbl>
+    <w:p>
+      <w:pPr>
+        <w:spacing w:after="160" w:before="0"/>
+      </w:pPr>
+      <w:r>
+        <w:rPr>
+          <w:rFonts w:ascii="Arial" w:cs="Arial" w:eastAsia="Arial" w:hAnsi="Arial"/>
+          <w:b w:val="false"/>
+          <w:bCs w:val="false"/>
+          <w:i w:val="false"/>
+          <w:iCs w:val="false"/>
+          <w:color w:val="1f2937"/>
+          <w:sz w:val="20"/>
+          <w:szCs w:val="20"/>
+        </w:rPr>
+        <w:t xml:space="preserve">Git will refuse to switch branches if you have any unsaved (uncommitted) changes. Always commit first, even if you already committed earlier — it is safe to run these again and Git will simply say 'nothing to commit' if there is nothing new.</w:t>
+      </w:r>
+    </w:p>
+    <w:p>
+      <w:pPr>
+        <w:spacing w:after="160" w:before="0"/>
+      </w:pPr>
+      <w:r>
+        <w:rPr>
+          <w:rFonts w:ascii="Arial" w:cs="Arial" w:eastAsia="Arial" w:hAnsi="Arial"/>
+          <w:b w:val="false"/>
+          <w:bCs w:val="false"/>
+          <w:i w:val="false"/>
+          <w:iCs w:val="false"/>
+          <w:color w:val="1f2937"/>
+          <w:sz w:val="20"/>
+          <w:szCs w:val="20"/>
+        </w:rPr>
+        <w:t xml:space="preserve"/>
+      </w:r>
+    </w:p>
+    <w:tbl>
+      <w:tblPr>
+        <w:tblW w:type="dxa" w:w="9360"/>
+        <w:tblBorders>
+          <w:top w:val="single" w:color="auto" w:sz="4"/>
+          <w:left w:val="single" w:color="auto" w:sz="4"/>
+          <w:bottom w:val="single" w:color="auto" w:sz="4"/>
+          <w:right w:val="single" w:color="auto" w:sz="4"/>
+          <w:insideH w:val="single" w:color="auto" w:sz="4"/>
+          <w:insideV w:val="single" w:color="auto" w:sz="4"/>
+        </w:tblBorders>
+      </w:tblPr>
+      <w:tblGrid>
+        <w:gridCol w:w="9360"/>
+      </w:tblGrid>
+      <w:tr>
+        <w:tc>
+          <w:tcPr>
+            <w:tcBorders>
+              <w:top w:val="single" w:color="FFE4B5" w:sz="1"/>
+              <w:left w:val="single" w:color="FFE4B5" w:sz="1"/>
+              <w:bottom w:val="single" w:color="FFE4B5" w:sz="1"/>
+              <w:right w:val="single" w:color="FFE4B5" w:sz="1"/>
+            </w:tcBorders>
+            <w:shd w:fill="FFE4B5" w:val="clear"/>
+            <w:tcMar>
+              <w:top w:type="dxa" w:w="100"/>
+              <w:left w:type="dxa" w:w="150"/>
+              <w:bottom w:type="dxa" w:w="100"/>
+              <w:right w:type="dxa" w:w="150"/>
+            </w:tcMar>
+            <w:vAlign w:val="top"/>
+          </w:tcPr>
+          <w:p>
+            <w:pPr>
+              <w:spacing w:after="80" w:before="0"/>
+            </w:pPr>
+            <w:r>
+              <w:rPr>
+                <w:rFonts w:ascii="Arial" w:cs="Arial" w:eastAsia="Arial" w:hAnsi="Arial"/>
+                <w:b/>
+                <w:bCs/>
+                <w:color w:val="1f2937"/>
+                <w:sz w:val="20"/>
+                <w:szCs w:val="20"/>
+              </w:rPr>
+              <w:t xml:space="preserve">⚠️  If git checkout main gives an error</w:t>
+            </w:r>
+          </w:p>
+          <w:p>
+            <w:pPr>
+              <w:spacing w:after="0" w:before="0"/>
+            </w:pPr>
+            <w:r>
+              <w:rPr>
+                <w:rFonts w:ascii="Arial" w:cs="Arial" w:eastAsia="Arial" w:hAnsi="Arial"/>
+                <w:color w:val="1f2937"/>
+                <w:sz w:val="19"/>
+                <w:szCs w:val="19"/>
+              </w:rPr>
+              <w:t xml:space="preserve">If you see 'error: Your local changes would be overwritten by checkout', it means you have uncommitted changes. Go back and run git add . and git commit -m "description" first, then try git checkout main again.</w:t>
+            </w:r>
+          </w:p>
+        </w:tc>
+      </w:tr>
+    </w:tbl>
+    <w:p>
+      <w:pPr>
+        <w:spacing w:after="160" w:before="0"/>
+      </w:pPr>
+      <w:r>
+        <w:rPr>
+          <w:rFonts w:ascii="Arial" w:cs="Arial" w:eastAsia="Arial" w:hAnsi="Arial"/>
+          <w:b w:val="false"/>
+          <w:bCs w:val="false"/>
+          <w:i w:val="false"/>
+          <w:iCs w:val="false"/>
+          <w:color w:val="1f2937"/>
+          <w:sz w:val="20"/>
+          <w:szCs w:val="20"/>
+        </w:rPr>
+        <w:t xml:space="preserve"/>
+      </w:r>
+    </w:p>
+    <w:p>
+      <w:pPr>
+        <w:pStyle w:val="Heading3"/>
+        <w:spacing w:after="120" w:before="240"/>
+      </w:pPr>
+      <w:r>
+        <w:rPr>
+          <w:rFonts w:ascii="Arial" w:cs="Arial" w:eastAsia="Arial" w:hAnsi="Arial"/>
+          <w:b/>
+          <w:bCs/>
+          <w:color w:val="1f2937"/>
+          <w:sz w:val="24"/>
+          <w:szCs w:val="24"/>
+        </w:rPr>
+        <w:t xml:space="preserve">Then — switch to main, merge, and push live</w:t>
+      </w:r>
+    </w:p>
+    <w:tbl>
+      <w:tblPr>
+        <w:tblW w:type="dxa" w:w="9360"/>
+        <w:tblBorders>
+          <w:top w:val="single" w:color="auto" w:sz="4"/>
+          <w:left w:val="single" w:color="auto" w:sz="4"/>
+          <w:bottom w:val="single" w:color="auto" w:sz="4"/>
+          <w:right w:val="single" w:color="auto" w:sz="4"/>
+          <w:insideH w:val="single" w:color="auto" w:sz="4"/>
+          <w:insideV w:val="single" w:color="auto" w:sz="4"/>
+        </w:tblBorders>
+      </w:tblPr>
+      <w:tblGrid>
+        <w:gridCol w:w="9360"/>
+      </w:tblGrid>
+      <w:tr>
+        <w:tc>
+          <w:tcPr>
+            <w:tcBorders>
+              <w:top w:val="single" w:color="cbd5e1" w:sz="1"/>
+              <w:left w:val="single" w:color="cbd5e1" w:sz="1"/>
+              <w:bottom w:val="single" w:color="cbd5e1" w:sz="1"/>
+              <w:right w:val="single" w:color="cbd5e1" w:sz="1"/>
+            </w:tcBorders>
+            <w:shd w:fill="f1f5f9" w:val="clear"/>
+            <w:tcMar>
+              <w:top w:type="dxa" w:w="100"/>
+              <w:left w:type="dxa" w:w="150"/>
+              <w:bottom w:type="dxa" w:w="100"/>
+              <w:right w:type="dxa" w:w="150"/>
+            </w:tcMar>
+            <w:vAlign w:val="top"/>
+          </w:tcPr>
+          <w:p>
+            <w:pPr>
+              <w:spacing w:after="60" w:before="0"/>
+            </w:pPr>
+            <w:r>
+              <w:rPr>
+                <w:rFonts w:ascii="Courier New" w:cs="Courier New" w:eastAsia="Courier New" w:hAnsi="Courier New"/>
+                <w:color w:val="1e40af"/>
+                <w:sz w:val="18"/>
+                <w:szCs w:val="18"/>
+              </w:rPr>
+              <w:t xml:space="preserve">git checkout main</w:t>
             </w:r>
           </w:p>
         </w:tc>
@@ -7943,212 +8165,7 @@
                 <w:sz w:val="18"/>
                 <w:szCs w:val="18"/>
               </w:rPr>
-              <w:t xml:space="preserve">git push origin main</w:t>
-            </w:r>
-          </w:p>
-        </w:tc>
-      </w:tr>
-    </w:tbl>
-    <w:p>
-      <w:pPr>
-        <w:spacing w:after="160" w:before="0"/>
-      </w:pPr>
-      <w:r>
-        <w:rPr>
-          <w:rFonts w:ascii="Arial" w:cs="Arial" w:eastAsia="Arial" w:hAnsi="Arial"/>
-          <w:b w:val="false"/>
-          <w:bCs w:val="false"/>
-          <w:i w:val="false"/>
-          <w:iCs w:val="false"/>
-          <w:color w:val="1f2937"/>
-          <w:sz w:val="20"/>
-          <w:szCs w:val="20"/>
-        </w:rPr>
-        <w:t xml:space="preserve">Cloudflare will rebuild the live site at creatinglinks.org within 60 seconds.</w:t>
-      </w:r>
-    </w:p>
-    <w:p>
-      <w:pPr>
-        <w:spacing w:after="160" w:before="0"/>
-      </w:pPr>
-      <w:r>
-        <w:rPr>
-          <w:rFonts w:ascii="Arial" w:cs="Arial" w:eastAsia="Arial" w:hAnsi="Arial"/>
-          <w:b w:val="false"/>
-          <w:bCs w:val="false"/>
-          <w:i w:val="false"/>
-          <w:iCs w:val="false"/>
-          <w:color w:val="1f2937"/>
-          <w:sz w:val="20"/>
-          <w:szCs w:val="20"/>
-        </w:rPr>
-        <w:t xml:space="preserve"/>
-      </w:r>
-    </w:p>
-    <w:tbl>
-      <w:tblPr>
-        <w:tblW w:type="dxa" w:w="9360"/>
-        <w:tblBorders>
-          <w:top w:val="single" w:color="auto" w:sz="4"/>
-          <w:left w:val="single" w:color="auto" w:sz="4"/>
-          <w:bottom w:val="single" w:color="auto" w:sz="4"/>
-          <w:right w:val="single" w:color="auto" w:sz="4"/>
-          <w:insideH w:val="single" w:color="auto" w:sz="4"/>
-          <w:insideV w:val="single" w:color="auto" w:sz="4"/>
-        </w:tblBorders>
-      </w:tblPr>
-      <w:tblGrid>
-        <w:gridCol w:w="9360"/>
-      </w:tblGrid>
-      <w:tr>
-        <w:tc>
-          <w:tcPr>
-            <w:tcBorders>
-              <w:top w:val="single" w:color="e0f2f1" w:sz="1"/>
-              <w:left w:val="single" w:color="e0f2f1" w:sz="1"/>
-              <w:bottom w:val="single" w:color="e0f2f1" w:sz="1"/>
-              <w:right w:val="single" w:color="e0f2f1" w:sz="1"/>
-            </w:tcBorders>
-            <w:shd w:fill="e0f2f1" w:val="clear"/>
-            <w:tcMar>
-              <w:top w:type="dxa" w:w="100"/>
-              <w:left w:type="dxa" w:w="150"/>
-              <w:bottom w:type="dxa" w:w="100"/>
-              <w:right w:type="dxa" w:w="150"/>
-            </w:tcMar>
-            <w:vAlign w:val="top"/>
-          </w:tcPr>
-          <w:p>
-            <w:pPr>
-              <w:spacing w:after="80" w:before="0"/>
-            </w:pPr>
-            <w:r>
-              <w:rPr>
-                <w:rFonts w:ascii="Arial" w:cs="Arial" w:eastAsia="Arial" w:hAnsi="Arial"/>
-                <w:b/>
-                <w:bCs/>
-                <w:color w:val="1f2937"/>
-                <w:sz w:val="20"/>
-                <w:szCs w:val="20"/>
-              </w:rPr>
-              <w:t xml:space="preserve">💡  After merging, switch back to staging</w:t>
-            </w:r>
-          </w:p>
-          <w:p>
-            <w:pPr>
-              <w:spacing w:after="0" w:before="0"/>
-            </w:pPr>
-            <w:r>
-              <w:rPr>
-                <w:rFonts w:ascii="Arial" w:cs="Arial" w:eastAsia="Arial" w:hAnsi="Arial"/>
-                <w:color w:val="1f2937"/>
-                <w:sz w:val="19"/>
-                <w:szCs w:val="19"/>
-              </w:rPr>
-              <w:t xml:space="preserve">Always return to the staging branch after merging so your next edit starts in the right place: git checkout staging</w:t>
-            </w:r>
-          </w:p>
-        </w:tc>
-      </w:tr>
-    </w:tbl>
-    <w:p>
-      <w:pPr>
-        <w:spacing w:after="160" w:before="0"/>
-      </w:pPr>
-      <w:r>
-        <w:rPr>
-          <w:rFonts w:ascii="Arial" w:cs="Arial" w:eastAsia="Arial" w:hAnsi="Arial"/>
-          <w:b w:val="false"/>
-          <w:bCs w:val="false"/>
-          <w:i w:val="false"/>
-          <w:iCs w:val="false"/>
-          <w:color w:val="1f2937"/>
-          <w:sz w:val="20"/>
-          <w:szCs w:val="20"/>
-        </w:rPr>
-        <w:t xml:space="preserve"/>
-      </w:r>
-    </w:p>
-    <w:p>
-      <w:pPr>
-        <w:pStyle w:val="Heading2"/>
-        <w:spacing w:after="160" w:before="320"/>
-      </w:pPr>
-      <w:r>
-        <w:rPr>
-          <w:rFonts w:ascii="Arial" w:cs="Arial" w:eastAsia="Arial" w:hAnsi="Arial"/>
-          <w:b/>
-          <w:bCs/>
-          <w:color w:val="267c88"/>
-          <w:sz w:val="28"/>
-          <w:szCs w:val="28"/>
-        </w:rPr>
-        <w:t xml:space="preserve">Full Publishing Example</w:t>
-      </w:r>
-    </w:p>
-    <w:p>
-      <w:pPr>
-        <w:spacing w:after="160" w:before="0"/>
-      </w:pPr>
-      <w:r>
-        <w:rPr>
-          <w:rFonts w:ascii="Arial" w:cs="Arial" w:eastAsia="Arial" w:hAnsi="Arial"/>
-          <w:b w:val="false"/>
-          <w:bCs w:val="false"/>
-          <w:i w:val="false"/>
-          <w:iCs w:val="false"/>
-          <w:color w:val="1f2937"/>
-          <w:sz w:val="20"/>
-          <w:szCs w:val="20"/>
-        </w:rPr>
-        <w:t xml:space="preserve">Here is what a complete editing session looks like from start to finish:</w:t>
-      </w:r>
-    </w:p>
-    <w:tbl>
-      <w:tblPr>
-        <w:tblW w:type="dxa" w:w="9360"/>
-        <w:tblBorders>
-          <w:top w:val="single" w:color="auto" w:sz="4"/>
-          <w:left w:val="single" w:color="auto" w:sz="4"/>
-          <w:bottom w:val="single" w:color="auto" w:sz="4"/>
-          <w:right w:val="single" w:color="auto" w:sz="4"/>
-          <w:insideH w:val="single" w:color="auto" w:sz="4"/>
-          <w:insideV w:val="single" w:color="auto" w:sz="4"/>
-        </w:tblBorders>
-      </w:tblPr>
-      <w:tblGrid>
-        <w:gridCol w:w="9360"/>
-      </w:tblGrid>
-      <w:tr>
-        <w:tc>
-          <w:tcPr>
-            <w:tcBorders>
-              <w:top w:val="single" w:color="cbd5e1" w:sz="1"/>
-              <w:left w:val="single" w:color="cbd5e1" w:sz="1"/>
-              <w:bottom w:val="single" w:color="cbd5e1" w:sz="1"/>
-              <w:right w:val="single" w:color="cbd5e1" w:sz="1"/>
-            </w:tcBorders>
-            <w:shd w:fill="f1f5f9" w:val="clear"/>
-            <w:tcMar>
-              <w:top w:type="dxa" w:w="100"/>
-              <w:left w:type="dxa" w:w="150"/>
-              <w:bottom w:type="dxa" w:w="100"/>
-              <w:right w:type="dxa" w:w="150"/>
-            </w:tcMar>
-            <w:vAlign w:val="top"/>
-          </w:tcPr>
-          <w:p>
-            <w:pPr>
-              <w:spacing w:after="60" w:before="0"/>
-            </w:pPr>
-            <w:r>
-              <w:rPr>
-                <w:rFonts w:ascii="Courier New" w:cs="Courier New" w:eastAsia="Courier New" w:hAnsi="Courier New"/>
-                <w:color w:val="1e40af"/>
-                <w:sz w:val="18"/>
-                <w:szCs w:val="18"/>
-              </w:rPr>
-              <w:t xml:space="preserve"># 1. Switch to the staging branch</w:t>
+              <w:t xml:space="preserve">git merge staging</w:t>
             </w:r>
           </w:p>
         </w:tc>
@@ -8198,7 +8215,212 @@
                 <w:sz w:val="18"/>
                 <w:szCs w:val="18"/>
               </w:rPr>
-              <w:t xml:space="preserve">git checkout staging</w:t>
+              <w:t xml:space="preserve">git push origin main</w:t>
+            </w:r>
+          </w:p>
+        </w:tc>
+      </w:tr>
+    </w:tbl>
+    <w:p>
+      <w:pPr>
+        <w:spacing w:after="160" w:before="0"/>
+      </w:pPr>
+      <w:r>
+        <w:rPr>
+          <w:rFonts w:ascii="Arial" w:cs="Arial" w:eastAsia="Arial" w:hAnsi="Arial"/>
+          <w:b w:val="false"/>
+          <w:bCs w:val="false"/>
+          <w:i w:val="false"/>
+          <w:iCs w:val="false"/>
+          <w:color w:val="1f2937"/>
+          <w:sz w:val="20"/>
+          <w:szCs w:val="20"/>
+        </w:rPr>
+        <w:t xml:space="preserve">Cloudflare will rebuild the live site at creatinglinks.org within 60 seconds.</w:t>
+      </w:r>
+    </w:p>
+    <w:p>
+      <w:pPr>
+        <w:spacing w:after="160" w:before="0"/>
+      </w:pPr>
+      <w:r>
+        <w:rPr>
+          <w:rFonts w:ascii="Arial" w:cs="Arial" w:eastAsia="Arial" w:hAnsi="Arial"/>
+          <w:b w:val="false"/>
+          <w:bCs w:val="false"/>
+          <w:i w:val="false"/>
+          <w:iCs w:val="false"/>
+          <w:color w:val="1f2937"/>
+          <w:sz w:val="20"/>
+          <w:szCs w:val="20"/>
+        </w:rPr>
+        <w:t xml:space="preserve"/>
+      </w:r>
+    </w:p>
+    <w:tbl>
+      <w:tblPr>
+        <w:tblW w:type="dxa" w:w="9360"/>
+        <w:tblBorders>
+          <w:top w:val="single" w:color="auto" w:sz="4"/>
+          <w:left w:val="single" w:color="auto" w:sz="4"/>
+          <w:bottom w:val="single" w:color="auto" w:sz="4"/>
+          <w:right w:val="single" w:color="auto" w:sz="4"/>
+          <w:insideH w:val="single" w:color="auto" w:sz="4"/>
+          <w:insideV w:val="single" w:color="auto" w:sz="4"/>
+        </w:tblBorders>
+      </w:tblPr>
+      <w:tblGrid>
+        <w:gridCol w:w="9360"/>
+      </w:tblGrid>
+      <w:tr>
+        <w:tc>
+          <w:tcPr>
+            <w:tcBorders>
+              <w:top w:val="single" w:color="e0f2f1" w:sz="1"/>
+              <w:left w:val="single" w:color="e0f2f1" w:sz="1"/>
+              <w:bottom w:val="single" w:color="e0f2f1" w:sz="1"/>
+              <w:right w:val="single" w:color="e0f2f1" w:sz="1"/>
+            </w:tcBorders>
+            <w:shd w:fill="e0f2f1" w:val="clear"/>
+            <w:tcMar>
+              <w:top w:type="dxa" w:w="100"/>
+              <w:left w:type="dxa" w:w="150"/>
+              <w:bottom w:type="dxa" w:w="100"/>
+              <w:right w:type="dxa" w:w="150"/>
+            </w:tcMar>
+            <w:vAlign w:val="top"/>
+          </w:tcPr>
+          <w:p>
+            <w:pPr>
+              <w:spacing w:after="80" w:before="0"/>
+            </w:pPr>
+            <w:r>
+              <w:rPr>
+                <w:rFonts w:ascii="Arial" w:cs="Arial" w:eastAsia="Arial" w:hAnsi="Arial"/>
+                <w:b/>
+                <w:bCs/>
+                <w:color w:val="1f2937"/>
+                <w:sz w:val="20"/>
+                <w:szCs w:val="20"/>
+              </w:rPr>
+              <w:t xml:space="preserve">💡  After merging, switch back to staging</w:t>
+            </w:r>
+          </w:p>
+          <w:p>
+            <w:pPr>
+              <w:spacing w:after="0" w:before="0"/>
+            </w:pPr>
+            <w:r>
+              <w:rPr>
+                <w:rFonts w:ascii="Arial" w:cs="Arial" w:eastAsia="Arial" w:hAnsi="Arial"/>
+                <w:color w:val="1f2937"/>
+                <w:sz w:val="19"/>
+                <w:szCs w:val="19"/>
+              </w:rPr>
+              <w:t xml:space="preserve">Always return to the staging branch after merging so your next edit starts in the right place: git checkout staging</w:t>
+            </w:r>
+          </w:p>
+        </w:tc>
+      </w:tr>
+    </w:tbl>
+    <w:p>
+      <w:pPr>
+        <w:spacing w:after="160" w:before="0"/>
+      </w:pPr>
+      <w:r>
+        <w:rPr>
+          <w:rFonts w:ascii="Arial" w:cs="Arial" w:eastAsia="Arial" w:hAnsi="Arial"/>
+          <w:b w:val="false"/>
+          <w:bCs w:val="false"/>
+          <w:i w:val="false"/>
+          <w:iCs w:val="false"/>
+          <w:color w:val="1f2937"/>
+          <w:sz w:val="20"/>
+          <w:szCs w:val="20"/>
+        </w:rPr>
+        <w:t xml:space="preserve"/>
+      </w:r>
+    </w:p>
+    <w:p>
+      <w:pPr>
+        <w:pStyle w:val="Heading2"/>
+        <w:spacing w:after="160" w:before="320"/>
+      </w:pPr>
+      <w:r>
+        <w:rPr>
+          <w:rFonts w:ascii="Arial" w:cs="Arial" w:eastAsia="Arial" w:hAnsi="Arial"/>
+          <w:b/>
+          <w:bCs/>
+          <w:color w:val="267c88"/>
+          <w:sz w:val="28"/>
+          <w:szCs w:val="28"/>
+        </w:rPr>
+        <w:t xml:space="preserve">Full Publishing Example</w:t>
+      </w:r>
+    </w:p>
+    <w:p>
+      <w:pPr>
+        <w:spacing w:after="160" w:before="0"/>
+      </w:pPr>
+      <w:r>
+        <w:rPr>
+          <w:rFonts w:ascii="Arial" w:cs="Arial" w:eastAsia="Arial" w:hAnsi="Arial"/>
+          <w:b w:val="false"/>
+          <w:bCs w:val="false"/>
+          <w:i w:val="false"/>
+          <w:iCs w:val="false"/>
+          <w:color w:val="1f2937"/>
+          <w:sz w:val="20"/>
+          <w:szCs w:val="20"/>
+        </w:rPr>
+        <w:t xml:space="preserve">Here is what a complete editing session looks like from start to finish:</w:t>
+      </w:r>
+    </w:p>
+    <w:tbl>
+      <w:tblPr>
+        <w:tblW w:type="dxa" w:w="9360"/>
+        <w:tblBorders>
+          <w:top w:val="single" w:color="auto" w:sz="4"/>
+          <w:left w:val="single" w:color="auto" w:sz="4"/>
+          <w:bottom w:val="single" w:color="auto" w:sz="4"/>
+          <w:right w:val="single" w:color="auto" w:sz="4"/>
+          <w:insideH w:val="single" w:color="auto" w:sz="4"/>
+          <w:insideV w:val="single" w:color="auto" w:sz="4"/>
+        </w:tblBorders>
+      </w:tblPr>
+      <w:tblGrid>
+        <w:gridCol w:w="9360"/>
+      </w:tblGrid>
+      <w:tr>
+        <w:tc>
+          <w:tcPr>
+            <w:tcBorders>
+              <w:top w:val="single" w:color="cbd5e1" w:sz="1"/>
+              <w:left w:val="single" w:color="cbd5e1" w:sz="1"/>
+              <w:bottom w:val="single" w:color="cbd5e1" w:sz="1"/>
+              <w:right w:val="single" w:color="cbd5e1" w:sz="1"/>
+            </w:tcBorders>
+            <w:shd w:fill="f1f5f9" w:val="clear"/>
+            <w:tcMar>
+              <w:top w:type="dxa" w:w="100"/>
+              <w:left w:type="dxa" w:w="150"/>
+              <w:bottom w:type="dxa" w:w="100"/>
+              <w:right w:type="dxa" w:w="150"/>
+            </w:tcMar>
+            <w:vAlign w:val="top"/>
+          </w:tcPr>
+          <w:p>
+            <w:pPr>
+              <w:spacing w:after="60" w:before="0"/>
+            </w:pPr>
+            <w:r>
+              <w:rPr>
+                <w:rFonts w:ascii="Courier New" w:cs="Courier New" w:eastAsia="Courier New" w:hAnsi="Courier New"/>
+                <w:color w:val="1e40af"/>
+                <w:sz w:val="18"/>
+                <w:szCs w:val="18"/>
+              </w:rPr>
+              <w:t xml:space="preserve"># 1. Switch to the staging branch</w:t>
             </w:r>
           </w:p>
         </w:tc>
@@ -8248,7 +8470,7 @@
                 <w:sz w:val="18"/>
                 <w:szCs w:val="18"/>
               </w:rPr>
-              <w:t xml:space="preserve"/>
+              <w:t xml:space="preserve">git checkout staging</w:t>
             </w:r>
           </w:p>
         </w:tc>
@@ -8298,7 +8520,7 @@
                 <w:sz w:val="18"/>
                 <w:szCs w:val="18"/>
               </w:rPr>
-              <w:t xml:space="preserve"># 2. Start a local preview (optional)</w:t>
+              <w:t xml:space="preserve"/>
             </w:r>
           </w:p>
         </w:tc>
@@ -8348,7 +8570,7 @@
                 <w:sz w:val="18"/>
                 <w:szCs w:val="18"/>
               </w:rPr>
-              <w:t xml:space="preserve">npm run dev</w:t>
+              <w:t xml:space="preserve"># 2. Start a local preview (optional)</w:t>
             </w:r>
           </w:p>
         </w:tc>
@@ -8398,7 +8620,7 @@
                 <w:sz w:val="18"/>
                 <w:szCs w:val="18"/>
               </w:rPr>
-              <w:t xml:space="preserve"/>
+              <w:t xml:space="preserve">npm run dev</w:t>
             </w:r>
           </w:p>
         </w:tc>
@@ -8448,7 +8670,7 @@
                 <w:sz w:val="18"/>
                 <w:szCs w:val="18"/>
               </w:rPr>
-              <w:t xml:space="preserve"># 3. Make your edits and save files in PyCharm</w:t>
+              <w:t xml:space="preserve"/>
             </w:r>
           </w:p>
         </w:tc>
@@ -8498,7 +8720,7 @@
                 <w:sz w:val="18"/>
                 <w:szCs w:val="18"/>
               </w:rPr>
-              <w:t xml:space="preserve"/>
+              <w:t xml:space="preserve"># 3. Make your edits and save files in PyCharm</w:t>
             </w:r>
           </w:p>
         </w:tc>
@@ -8548,7 +8770,7 @@
                 <w:sz w:val="18"/>
                 <w:szCs w:val="18"/>
               </w:rPr>
-              <w:t xml:space="preserve"># 4. Stop the local preview (press Ctrl+C)</w:t>
+              <w:t xml:space="preserve"/>
             </w:r>
           </w:p>
         </w:tc>
@@ -8598,7 +8820,7 @@
                 <w:sz w:val="18"/>
                 <w:szCs w:val="18"/>
               </w:rPr>
-              <w:t xml:space="preserve"/>
+              <w:t xml:space="preserve"># 4. Stop the local preview (press Ctrl+C)</w:t>
             </w:r>
           </w:p>
         </w:tc>
@@ -8648,7 +8870,7 @@
                 <w:sz w:val="18"/>
                 <w:szCs w:val="18"/>
               </w:rPr>
-              <w:t xml:space="preserve"># 5. Stage and commit your changes</w:t>
+              <w:t xml:space="preserve"/>
             </w:r>
           </w:p>
         </w:tc>
@@ -8698,7 +8920,7 @@
                 <w:sz w:val="18"/>
                 <w:szCs w:val="18"/>
               </w:rPr>
-              <w:t xml:space="preserve">git add .</w:t>
+              <w:t xml:space="preserve"># 5. Stage and commit your changes</w:t>
             </w:r>
           </w:p>
         </w:tc>
@@ -8748,7 +8970,7 @@
                 <w:sz w:val="18"/>
                 <w:szCs w:val="18"/>
               </w:rPr>
-              <w:t xml:space="preserve">git commit -m "Added two new Google reviews"</w:t>
+              <w:t xml:space="preserve">git add .</w:t>
             </w:r>
           </w:p>
         </w:tc>
@@ -8798,7 +9020,7 @@
                 <w:sz w:val="18"/>
                 <w:szCs w:val="18"/>
               </w:rPr>
-              <w:t xml:space="preserve"/>
+              <w:t xml:space="preserve">git commit -m "Added two new Google reviews"</w:t>
             </w:r>
           </w:p>
         </w:tc>
@@ -8848,7 +9070,7 @@
                 <w:sz w:val="18"/>
                 <w:szCs w:val="18"/>
               </w:rPr>
-              <w:t xml:space="preserve"># 6. Push to staging and check the Cloudflare preview URL</w:t>
+              <w:t xml:space="preserve"/>
             </w:r>
           </w:p>
         </w:tc>
@@ -8898,7 +9120,7 @@
                 <w:sz w:val="18"/>
                 <w:szCs w:val="18"/>
               </w:rPr>
-              <w:t xml:space="preserve">git push origin staging</w:t>
+              <w:t xml:space="preserve"># 6. Push to staging and check the Cloudflare preview URL</w:t>
             </w:r>
           </w:p>
         </w:tc>
@@ -8948,7 +9170,7 @@
                 <w:sz w:val="18"/>
                 <w:szCs w:val="18"/>
               </w:rPr>
-              <w:t xml:space="preserve"/>
+              <w:t xml:space="preserve">git push origin staging</w:t>
             </w:r>
           </w:p>
         </w:tc>
@@ -8998,7 +9220,7 @@
                 <w:sz w:val="18"/>
                 <w:szCs w:val="18"/>
               </w:rPr>
-              <w:t xml:space="preserve"># 7. When happy, merge to main to go live</w:t>
+              <w:t xml:space="preserve"/>
             </w:r>
           </w:p>
         </w:tc>
@@ -9048,7 +9270,7 @@
                 <w:sz w:val="18"/>
                 <w:szCs w:val="18"/>
               </w:rPr>
-              <w:t xml:space="preserve">git checkout main</w:t>
+              <w:t xml:space="preserve"># 7. When happy, merge to main to go live</w:t>
             </w:r>
           </w:p>
         </w:tc>
@@ -9098,7 +9320,7 @@
                 <w:sz w:val="18"/>
                 <w:szCs w:val="18"/>
               </w:rPr>
-              <w:t xml:space="preserve">git merge staging</w:t>
+              <w:t xml:space="preserve">git checkout main</w:t>
             </w:r>
           </w:p>
         </w:tc>
@@ -9148,7 +9370,7 @@
                 <w:sz w:val="18"/>
                 <w:szCs w:val="18"/>
               </w:rPr>
-              <w:t xml:space="preserve">git push origin main</w:t>
+              <w:t xml:space="preserve">git merge staging</w:t>
             </w:r>
           </w:p>
         </w:tc>
@@ -9198,7 +9420,7 @@
                 <w:sz w:val="18"/>
                 <w:szCs w:val="18"/>
               </w:rPr>
-              <w:t xml:space="preserve"/>
+              <w:t xml:space="preserve">git push origin main</w:t>
             </w:r>
           </w:p>
         </w:tc>
@@ -9248,7 +9470,7 @@
                 <w:sz w:val="18"/>
                 <w:szCs w:val="18"/>
               </w:rPr>
-              <w:t xml:space="preserve"># 8. Switch back to staging for your next change</w:t>
+              <w:t xml:space="preserve"/>
             </w:r>
           </w:p>
         </w:tc>
@@ -9298,87 +9520,12 @@
                 <w:sz w:val="18"/>
                 <w:szCs w:val="18"/>
               </w:rPr>
-              <w:t xml:space="preserve">git checkout staging</w:t>
+              <w:t xml:space="preserve"># 8. Switch back to staging for your next change</w:t>
             </w:r>
           </w:p>
         </w:tc>
       </w:tr>
     </w:tbl>
-    <w:p>
-      <w:r>
-        <w:br w:type="page"/>
-      </w:r>
-    </w:p>
-    <w:p>
-      <w:pPr>
-        <w:pStyle w:val="Heading1"/>
-        <w:spacing w:after="200" w:before="360"/>
-      </w:pPr>
-      <w:r>
-        <w:rPr>
-          <w:rFonts w:ascii="Arial" w:cs="Arial" w:eastAsia="Arial" w:hAnsi="Arial"/>
-          <w:b/>
-          <w:bCs/>
-          <w:color w:val="267c88"/>
-          <w:sz w:val="36"/>
-          <w:szCs w:val="36"/>
-        </w:rPr>
-        <w:t xml:space="preserve">Troubleshooting</w:t>
-      </w:r>
-    </w:p>
-    <w:p>
-      <w:pPr>
-        <w:spacing w:after="160" w:before="0"/>
-      </w:pPr>
-      <w:r>
-        <w:rPr>
-          <w:rFonts w:ascii="Arial" w:cs="Arial" w:eastAsia="Arial" w:hAnsi="Arial"/>
-          <w:b w:val="false"/>
-          <w:bCs w:val="false"/>
-          <w:i w:val="false"/>
-          <w:iCs w:val="false"/>
-          <w:color w:val="1f2937"/>
-          <w:sz w:val="20"/>
-          <w:szCs w:val="20"/>
-        </w:rPr>
-        <w:t xml:space="preserve"/>
-      </w:r>
-    </w:p>
-    <w:p>
-      <w:pPr>
-        <w:pStyle w:val="Heading2"/>
-        <w:spacing w:after="160" w:before="320"/>
-      </w:pPr>
-      <w:r>
-        <w:rPr>
-          <w:rFonts w:ascii="Arial" w:cs="Arial" w:eastAsia="Arial" w:hAnsi="Arial"/>
-          <w:b/>
-          <w:bCs/>
-          <w:color w:val="267c88"/>
-          <w:sz w:val="28"/>
-          <w:szCs w:val="28"/>
-        </w:rPr>
-        <w:t xml:space="preserve">Problem: The site won't build / I see a red error</w:t>
-      </w:r>
-    </w:p>
-    <w:p>
-      <w:pPr>
-        <w:spacing w:after="160" w:before="0"/>
-      </w:pPr>
-      <w:r>
-        <w:rPr>
-          <w:rFonts w:ascii="Arial" w:cs="Arial" w:eastAsia="Arial" w:hAnsi="Arial"/>
-          <w:b w:val="false"/>
-          <w:bCs w:val="false"/>
-          <w:i w:val="false"/>
-          <w:iCs w:val="false"/>
-          <w:color w:val="1f2937"/>
-          <w:sz w:val="20"/>
-          <w:szCs w:val="20"/>
-        </w:rPr>
-        <w:t xml:space="preserve">Run this command to see the error:</w:t>
-      </w:r>
-    </w:p>
     <w:tbl>
       <w:tblPr>
         <w:tblW w:type="dxa" w:w="9360"/>
@@ -9423,12 +9570,34 @@
                 <w:sz w:val="18"/>
                 <w:szCs w:val="18"/>
               </w:rPr>
-              <w:t xml:space="preserve">npm run build</w:t>
+              <w:t xml:space="preserve">git checkout staging</w:t>
             </w:r>
           </w:p>
         </w:tc>
       </w:tr>
     </w:tbl>
+    <w:p>
+      <w:r>
+        <w:br w:type="page"/>
+      </w:r>
+    </w:p>
+    <w:p>
+      <w:pPr>
+        <w:pStyle w:val="Heading1"/>
+        <w:spacing w:after="200" w:before="360"/>
+      </w:pPr>
+      <w:r>
+        <w:rPr>
+          <w:rFonts w:ascii="Arial" w:cs="Arial" w:eastAsia="Arial" w:hAnsi="Arial"/>
+          <w:b/>
+          <w:bCs/>
+          <w:color w:val="267c88"/>
+          <w:sz w:val="36"/>
+          <w:szCs w:val="36"/>
+        </w:rPr>
+        <w:t xml:space="preserve">Troubleshooting</w:t>
+      </w:r>
+    </w:p>
     <w:p>
       <w:pPr>
         <w:spacing w:after="160" w:before="0"/>
@@ -9444,70 +9613,24 @@
           <w:sz w:val="20"/>
           <w:szCs w:val="20"/>
         </w:rPr>
-        <w:t xml:space="preserve">The error message will name the exact file and line number. The most common causes are:</w:t>
-      </w:r>
-    </w:p>
-    <w:p>
-      <w:pPr>
-        <w:pStyle w:val="ListParagraph"/>
-        <w:numPr>
-          <w:ilvl w:val="0"/>
-          <w:numId w:val="3"/>
-        </w:numPr>
-        <w:spacing w:after="100" w:before="0"/>
-      </w:pPr>
-      <w:r>
-        <w:rPr>
-          <w:rFonts w:ascii="Arial" w:cs="Arial" w:eastAsia="Arial" w:hAnsi="Arial"/>
-          <w:b w:val="false"/>
-          <w:bCs w:val="false"/>
-          <w:color w:val="1f2937"/>
-          <w:sz w:val="20"/>
-          <w:szCs w:val="20"/>
-        </w:rPr>
-        <w:t xml:space="preserve">A missing or extra comma in a .json file (the most common cause by far)</w:t>
-      </w:r>
-    </w:p>
-    <w:p>
-      <w:pPr>
-        <w:pStyle w:val="ListParagraph"/>
-        <w:numPr>
-          <w:ilvl w:val="0"/>
-          <w:numId w:val="3"/>
-        </w:numPr>
-        <w:spacing w:after="100" w:before="0"/>
-      </w:pPr>
-      <w:r>
-        <w:rPr>
-          <w:rFonts w:ascii="Arial" w:cs="Arial" w:eastAsia="Arial" w:hAnsi="Arial"/>
-          <w:b w:val="false"/>
-          <w:bCs w:val="false"/>
-          <w:color w:val="1f2937"/>
-          <w:sz w:val="20"/>
-          <w:szCs w:val="20"/>
-        </w:rPr>
-        <w:t xml:space="preserve">A deleted HTML tag in a .astro file</w:t>
-      </w:r>
-    </w:p>
-    <w:p>
-      <w:pPr>
-        <w:pStyle w:val="ListParagraph"/>
-        <w:numPr>
-          <w:ilvl w:val="0"/>
-          <w:numId w:val="3"/>
-        </w:numPr>
-        <w:spacing w:after="100" w:before="0"/>
-      </w:pPr>
-      <w:r>
-        <w:rPr>
-          <w:rFonts w:ascii="Arial" w:cs="Arial" w:eastAsia="Arial" w:hAnsi="Arial"/>
-          <w:b w:val="false"/>
-          <w:bCs w:val="false"/>
-          <w:color w:val="1f2937"/>
-          <w:sz w:val="20"/>
-          <w:szCs w:val="20"/>
-        </w:rPr>
-        <w:t xml:space="preserve">A quote mark that was accidentally deleted</w:t>
+        <w:t xml:space="preserve"/>
+      </w:r>
+    </w:p>
+    <w:p>
+      <w:pPr>
+        <w:pStyle w:val="Heading2"/>
+        <w:spacing w:after="160" w:before="320"/>
+      </w:pPr>
+      <w:r>
+        <w:rPr>
+          <w:rFonts w:ascii="Arial" w:cs="Arial" w:eastAsia="Arial" w:hAnsi="Arial"/>
+          <w:b/>
+          <w:bCs/>
+          <w:color w:val="267c88"/>
+          <w:sz w:val="28"/>
+          <w:szCs w:val="28"/>
+        </w:rPr>
+        <w:t xml:space="preserve">Problem: The site won't build / I see a red error</w:t>
       </w:r>
     </w:p>
     <w:p>
@@ -9525,7 +9648,7 @@
           <w:sz w:val="20"/>
           <w:szCs w:val="20"/>
         </w:rPr>
-        <w:t xml:space="preserve"/>
+        <w:t xml:space="preserve">Run this command to see the error:</w:t>
       </w:r>
     </w:p>
     <w:tbl>
@@ -9547,6 +9670,155 @@
         <w:tc>
           <w:tcPr>
             <w:tcBorders>
+              <w:top w:val="single" w:color="cbd5e1" w:sz="1"/>
+              <w:left w:val="single" w:color="cbd5e1" w:sz="1"/>
+              <w:bottom w:val="single" w:color="cbd5e1" w:sz="1"/>
+              <w:right w:val="single" w:color="cbd5e1" w:sz="1"/>
+            </w:tcBorders>
+            <w:shd w:fill="f1f5f9" w:val="clear"/>
+            <w:tcMar>
+              <w:top w:type="dxa" w:w="100"/>
+              <w:left w:type="dxa" w:w="150"/>
+              <w:bottom w:type="dxa" w:w="100"/>
+              <w:right w:type="dxa" w:w="150"/>
+            </w:tcMar>
+            <w:vAlign w:val="top"/>
+          </w:tcPr>
+          <w:p>
+            <w:pPr>
+              <w:spacing w:after="60" w:before="0"/>
+            </w:pPr>
+            <w:r>
+              <w:rPr>
+                <w:rFonts w:ascii="Courier New" w:cs="Courier New" w:eastAsia="Courier New" w:hAnsi="Courier New"/>
+                <w:color w:val="1e40af"/>
+                <w:sz w:val="18"/>
+                <w:szCs w:val="18"/>
+              </w:rPr>
+              <w:t xml:space="preserve">npm run build</w:t>
+            </w:r>
+          </w:p>
+        </w:tc>
+      </w:tr>
+    </w:tbl>
+    <w:p>
+      <w:pPr>
+        <w:spacing w:after="160" w:before="0"/>
+      </w:pPr>
+      <w:r>
+        <w:rPr>
+          <w:rFonts w:ascii="Arial" w:cs="Arial" w:eastAsia="Arial" w:hAnsi="Arial"/>
+          <w:b w:val="false"/>
+          <w:bCs w:val="false"/>
+          <w:i w:val="false"/>
+          <w:iCs w:val="false"/>
+          <w:color w:val="1f2937"/>
+          <w:sz w:val="20"/>
+          <w:szCs w:val="20"/>
+        </w:rPr>
+        <w:t xml:space="preserve">The error message will name the exact file and line number. The most common causes are:</w:t>
+      </w:r>
+    </w:p>
+    <w:p>
+      <w:pPr>
+        <w:pStyle w:val="ListParagraph"/>
+        <w:numPr>
+          <w:ilvl w:val="0"/>
+          <w:numId w:val="3"/>
+        </w:numPr>
+        <w:spacing w:after="100" w:before="0"/>
+      </w:pPr>
+      <w:r>
+        <w:rPr>
+          <w:rFonts w:ascii="Arial" w:cs="Arial" w:eastAsia="Arial" w:hAnsi="Arial"/>
+          <w:b w:val="false"/>
+          <w:bCs w:val="false"/>
+          <w:color w:val="1f2937"/>
+          <w:sz w:val="20"/>
+          <w:szCs w:val="20"/>
+        </w:rPr>
+        <w:t xml:space="preserve">A missing or extra comma in a .json file (the most common cause by far)</w:t>
+      </w:r>
+    </w:p>
+    <w:p>
+      <w:pPr>
+        <w:pStyle w:val="ListParagraph"/>
+        <w:numPr>
+          <w:ilvl w:val="0"/>
+          <w:numId w:val="3"/>
+        </w:numPr>
+        <w:spacing w:after="100" w:before="0"/>
+      </w:pPr>
+      <w:r>
+        <w:rPr>
+          <w:rFonts w:ascii="Arial" w:cs="Arial" w:eastAsia="Arial" w:hAnsi="Arial"/>
+          <w:b w:val="false"/>
+          <w:bCs w:val="false"/>
+          <w:color w:val="1f2937"/>
+          <w:sz w:val="20"/>
+          <w:szCs w:val="20"/>
+        </w:rPr>
+        <w:t xml:space="preserve">A deleted HTML tag in a .astro file</w:t>
+      </w:r>
+    </w:p>
+    <w:p>
+      <w:pPr>
+        <w:pStyle w:val="ListParagraph"/>
+        <w:numPr>
+          <w:ilvl w:val="0"/>
+          <w:numId w:val="3"/>
+        </w:numPr>
+        <w:spacing w:after="100" w:before="0"/>
+      </w:pPr>
+      <w:r>
+        <w:rPr>
+          <w:rFonts w:ascii="Arial" w:cs="Arial" w:eastAsia="Arial" w:hAnsi="Arial"/>
+          <w:b w:val="false"/>
+          <w:bCs w:val="false"/>
+          <w:color w:val="1f2937"/>
+          <w:sz w:val="20"/>
+          <w:szCs w:val="20"/>
+        </w:rPr>
+        <w:t xml:space="preserve">A quote mark that was accidentally deleted</w:t>
+      </w:r>
+    </w:p>
+    <w:p>
+      <w:pPr>
+        <w:spacing w:after="160" w:before="0"/>
+      </w:pPr>
+      <w:r>
+        <w:rPr>
+          <w:rFonts w:ascii="Arial" w:cs="Arial" w:eastAsia="Arial" w:hAnsi="Arial"/>
+          <w:b w:val="false"/>
+          <w:bCs w:val="false"/>
+          <w:i w:val="false"/>
+          <w:iCs w:val="false"/>
+          <w:color w:val="1f2937"/>
+          <w:sz w:val="20"/>
+          <w:szCs w:val="20"/>
+        </w:rPr>
+        <w:t xml:space="preserve"/>
+      </w:r>
+    </w:p>
+    <w:tbl>
+      <w:tblPr>
+        <w:tblW w:type="dxa" w:w="9360"/>
+        <w:tblBorders>
+          <w:top w:val="single" w:color="auto" w:sz="4"/>
+          <w:left w:val="single" w:color="auto" w:sz="4"/>
+          <w:bottom w:val="single" w:color="auto" w:sz="4"/>
+          <w:right w:val="single" w:color="auto" w:sz="4"/>
+          <w:insideH w:val="single" w:color="auto" w:sz="4"/>
+          <w:insideV w:val="single" w:color="auto" w:sz="4"/>
+        </w:tblBorders>
+      </w:tblPr>
+      <w:tblGrid>
+        <w:gridCol w:w="9360"/>
+      </w:tblGrid>
+      <w:tr>
+        <w:tc>
+          <w:tcPr>
+            <w:tcBorders>
               <w:top w:val="single" w:color="e0f2f1" w:sz="1"/>
               <w:left w:val="single" w:color="e0f2f1" w:sz="1"/>
               <w:bottom w:val="single" w:color="e0f2f1" w:sz="1"/>
@@ -9626,6 +9898,498 @@
           <w:sz w:val="28"/>
           <w:szCs w:val="28"/>
         </w:rPr>
+        <w:t xml:space="preserve">Problem: git checkout main says 'Your local changes would be overwritten'</w:t>
+      </w:r>
+    </w:p>
+    <w:p>
+      <w:pPr>
+        <w:spacing w:after="160" w:before="0"/>
+      </w:pPr>
+      <w:r>
+        <w:rPr>
+          <w:rFonts w:ascii="Arial" w:cs="Arial" w:eastAsia="Arial" w:hAnsi="Arial"/>
+          <w:b w:val="false"/>
+          <w:bCs w:val="false"/>
+          <w:i w:val="false"/>
+          <w:iCs w:val="false"/>
+          <w:color w:val="1f2937"/>
+          <w:sz w:val="20"/>
+          <w:szCs w:val="20"/>
+        </w:rPr>
+        <w:t xml:space="preserve">This happens when you try to switch to the main branch but still have uncommitted changes on staging. Fix it by committing first:</w:t>
+      </w:r>
+    </w:p>
+    <w:tbl>
+      <w:tblPr>
+        <w:tblW w:type="dxa" w:w="9360"/>
+        <w:tblBorders>
+          <w:top w:val="single" w:color="auto" w:sz="4"/>
+          <w:left w:val="single" w:color="auto" w:sz="4"/>
+          <w:bottom w:val="single" w:color="auto" w:sz="4"/>
+          <w:right w:val="single" w:color="auto" w:sz="4"/>
+          <w:insideH w:val="single" w:color="auto" w:sz="4"/>
+          <w:insideV w:val="single" w:color="auto" w:sz="4"/>
+        </w:tblBorders>
+      </w:tblPr>
+      <w:tblGrid>
+        <w:gridCol w:w="9360"/>
+      </w:tblGrid>
+      <w:tr>
+        <w:tc>
+          <w:tcPr>
+            <w:tcBorders>
+              <w:top w:val="single" w:color="cbd5e1" w:sz="1"/>
+              <w:left w:val="single" w:color="cbd5e1" w:sz="1"/>
+              <w:bottom w:val="single" w:color="cbd5e1" w:sz="1"/>
+              <w:right w:val="single" w:color="cbd5e1" w:sz="1"/>
+            </w:tcBorders>
+            <w:shd w:fill="f1f5f9" w:val="clear"/>
+            <w:tcMar>
+              <w:top w:type="dxa" w:w="100"/>
+              <w:left w:type="dxa" w:w="150"/>
+              <w:bottom w:type="dxa" w:w="100"/>
+              <w:right w:type="dxa" w:w="150"/>
+            </w:tcMar>
+            <w:vAlign w:val="top"/>
+          </w:tcPr>
+          <w:p>
+            <w:pPr>
+              <w:spacing w:after="60" w:before="0"/>
+            </w:pPr>
+            <w:r>
+              <w:rPr>
+                <w:rFonts w:ascii="Courier New" w:cs="Courier New" w:eastAsia="Courier New" w:hAnsi="Courier New"/>
+                <w:color w:val="1e40af"/>
+                <w:sz w:val="18"/>
+                <w:szCs w:val="18"/>
+              </w:rPr>
+              <w:t xml:space="preserve">git add .</w:t>
+            </w:r>
+          </w:p>
+        </w:tc>
+      </w:tr>
+    </w:tbl>
+    <w:tbl>
+      <w:tblPr>
+        <w:tblW w:type="dxa" w:w="9360"/>
+        <w:tblBorders>
+          <w:top w:val="single" w:color="auto" w:sz="4"/>
+          <w:left w:val="single" w:color="auto" w:sz="4"/>
+          <w:bottom w:val="single" w:color="auto" w:sz="4"/>
+          <w:right w:val="single" w:color="auto" w:sz="4"/>
+          <w:insideH w:val="single" w:color="auto" w:sz="4"/>
+          <w:insideV w:val="single" w:color="auto" w:sz="4"/>
+        </w:tblBorders>
+      </w:tblPr>
+      <w:tblGrid>
+        <w:gridCol w:w="9360"/>
+      </w:tblGrid>
+      <w:tr>
+        <w:tc>
+          <w:tcPr>
+            <w:tcBorders>
+              <w:top w:val="single" w:color="cbd5e1" w:sz="1"/>
+              <w:left w:val="single" w:color="cbd5e1" w:sz="1"/>
+              <w:bottom w:val="single" w:color="cbd5e1" w:sz="1"/>
+              <w:right w:val="single" w:color="cbd5e1" w:sz="1"/>
+            </w:tcBorders>
+            <w:shd w:fill="f1f5f9" w:val="clear"/>
+            <w:tcMar>
+              <w:top w:type="dxa" w:w="100"/>
+              <w:left w:type="dxa" w:w="150"/>
+              <w:bottom w:type="dxa" w:w="100"/>
+              <w:right w:type="dxa" w:w="150"/>
+            </w:tcMar>
+            <w:vAlign w:val="top"/>
+          </w:tcPr>
+          <w:p>
+            <w:pPr>
+              <w:spacing w:after="60" w:before="0"/>
+            </w:pPr>
+            <w:r>
+              <w:rPr>
+                <w:rFonts w:ascii="Courier New" w:cs="Courier New" w:eastAsia="Courier New" w:hAnsi="Courier New"/>
+                <w:color w:val="1e40af"/>
+                <w:sz w:val="18"/>
+                <w:szCs w:val="18"/>
+              </w:rPr>
+              <w:t xml:space="preserve">git commit -m "Committing before switching to main"</w:t>
+            </w:r>
+          </w:p>
+        </w:tc>
+      </w:tr>
+    </w:tbl>
+    <w:tbl>
+      <w:tblPr>
+        <w:tblW w:type="dxa" w:w="9360"/>
+        <w:tblBorders>
+          <w:top w:val="single" w:color="auto" w:sz="4"/>
+          <w:left w:val="single" w:color="auto" w:sz="4"/>
+          <w:bottom w:val="single" w:color="auto" w:sz="4"/>
+          <w:right w:val="single" w:color="auto" w:sz="4"/>
+          <w:insideH w:val="single" w:color="auto" w:sz="4"/>
+          <w:insideV w:val="single" w:color="auto" w:sz="4"/>
+        </w:tblBorders>
+      </w:tblPr>
+      <w:tblGrid>
+        <w:gridCol w:w="9360"/>
+      </w:tblGrid>
+      <w:tr>
+        <w:tc>
+          <w:tcPr>
+            <w:tcBorders>
+              <w:top w:val="single" w:color="cbd5e1" w:sz="1"/>
+              <w:left w:val="single" w:color="cbd5e1" w:sz="1"/>
+              <w:bottom w:val="single" w:color="cbd5e1" w:sz="1"/>
+              <w:right w:val="single" w:color="cbd5e1" w:sz="1"/>
+            </w:tcBorders>
+            <w:shd w:fill="f1f5f9" w:val="clear"/>
+            <w:tcMar>
+              <w:top w:type="dxa" w:w="100"/>
+              <w:left w:type="dxa" w:w="150"/>
+              <w:bottom w:type="dxa" w:w="100"/>
+              <w:right w:type="dxa" w:w="150"/>
+            </w:tcMar>
+            <w:vAlign w:val="top"/>
+          </w:tcPr>
+          <w:p>
+            <w:pPr>
+              <w:spacing w:after="60" w:before="0"/>
+            </w:pPr>
+            <w:r>
+              <w:rPr>
+                <w:rFonts w:ascii="Courier New" w:cs="Courier New" w:eastAsia="Courier New" w:hAnsi="Courier New"/>
+                <w:color w:val="1e40af"/>
+                <w:sz w:val="18"/>
+                <w:szCs w:val="18"/>
+              </w:rPr>
+              <w:t xml:space="preserve">git checkout main</w:t>
+            </w:r>
+          </w:p>
+        </w:tc>
+      </w:tr>
+    </w:tbl>
+    <w:p>
+      <w:pPr>
+        <w:spacing w:after="160" w:before="0"/>
+      </w:pPr>
+      <w:r>
+        <w:rPr>
+          <w:rFonts w:ascii="Arial" w:cs="Arial" w:eastAsia="Arial" w:hAnsi="Arial"/>
+          <w:b w:val="false"/>
+          <w:bCs w:val="false"/>
+          <w:i w:val="false"/>
+          <w:iCs w:val="false"/>
+          <w:color w:val="1f2937"/>
+          <w:sz w:val="20"/>
+          <w:szCs w:val="20"/>
+        </w:rPr>
+        <w:t xml:space="preserve">After committing, the branch switch will work. Then continue with git merge staging and git push origin main as normal.</w:t>
+      </w:r>
+    </w:p>
+    <w:p>
+      <w:pPr>
+        <w:spacing w:after="160" w:before="0"/>
+      </w:pPr>
+      <w:r>
+        <w:rPr>
+          <w:rFonts w:ascii="Arial" w:cs="Arial" w:eastAsia="Arial" w:hAnsi="Arial"/>
+          <w:b w:val="false"/>
+          <w:bCs w:val="false"/>
+          <w:i w:val="false"/>
+          <w:iCs w:val="false"/>
+          <w:color w:val="1f2937"/>
+          <w:sz w:val="20"/>
+          <w:szCs w:val="20"/>
+        </w:rPr>
+        <w:t xml:space="preserve"/>
+      </w:r>
+    </w:p>
+    <w:p>
+      <w:pPr>
+        <w:pStyle w:val="Heading2"/>
+        <w:spacing w:after="160" w:before="320"/>
+      </w:pPr>
+      <w:r>
+        <w:rPr>
+          <w:rFonts w:ascii="Arial" w:cs="Arial" w:eastAsia="Arial" w:hAnsi="Arial"/>
+          <w:b/>
+          <w:bCs/>
+          <w:color w:val="267c88"/>
+          <w:sz w:val="28"/>
+          <w:szCs w:val="28"/>
+        </w:rPr>
+        <w:t xml:space="preserve">Problem: git push origin main says 'Everything up-to-date' but site has not changed</w:t>
+      </w:r>
+    </w:p>
+    <w:p>
+      <w:pPr>
+        <w:spacing w:after="160" w:before="0"/>
+      </w:pPr>
+      <w:r>
+        <w:rPr>
+          <w:rFonts w:ascii="Arial" w:cs="Arial" w:eastAsia="Arial" w:hAnsi="Arial"/>
+          <w:b w:val="false"/>
+          <w:bCs w:val="false"/>
+          <w:i w:val="false"/>
+          <w:iCs w:val="false"/>
+          <w:color w:val="1f2937"/>
+          <w:sz w:val="20"/>
+          <w:szCs w:val="20"/>
+        </w:rPr>
+        <w:t xml:space="preserve">This means main was never updated with your staging changes. It usually happens when git checkout main was skipped. Check which branch you are on:</w:t>
+      </w:r>
+    </w:p>
+    <w:tbl>
+      <w:tblPr>
+        <w:tblW w:type="dxa" w:w="9360"/>
+        <w:tblBorders>
+          <w:top w:val="single" w:color="auto" w:sz="4"/>
+          <w:left w:val="single" w:color="auto" w:sz="4"/>
+          <w:bottom w:val="single" w:color="auto" w:sz="4"/>
+          <w:right w:val="single" w:color="auto" w:sz="4"/>
+          <w:insideH w:val="single" w:color="auto" w:sz="4"/>
+          <w:insideV w:val="single" w:color="auto" w:sz="4"/>
+        </w:tblBorders>
+      </w:tblPr>
+      <w:tblGrid>
+        <w:gridCol w:w="9360"/>
+      </w:tblGrid>
+      <w:tr>
+        <w:tc>
+          <w:tcPr>
+            <w:tcBorders>
+              <w:top w:val="single" w:color="cbd5e1" w:sz="1"/>
+              <w:left w:val="single" w:color="cbd5e1" w:sz="1"/>
+              <w:bottom w:val="single" w:color="cbd5e1" w:sz="1"/>
+              <w:right w:val="single" w:color="cbd5e1" w:sz="1"/>
+            </w:tcBorders>
+            <w:shd w:fill="f1f5f9" w:val="clear"/>
+            <w:tcMar>
+              <w:top w:type="dxa" w:w="100"/>
+              <w:left w:type="dxa" w:w="150"/>
+              <w:bottom w:type="dxa" w:w="100"/>
+              <w:right w:type="dxa" w:w="150"/>
+            </w:tcMar>
+            <w:vAlign w:val="top"/>
+          </w:tcPr>
+          <w:p>
+            <w:pPr>
+              <w:spacing w:after="60" w:before="0"/>
+            </w:pPr>
+            <w:r>
+              <w:rPr>
+                <w:rFonts w:ascii="Courier New" w:cs="Courier New" w:eastAsia="Courier New" w:hAnsi="Courier New"/>
+                <w:color w:val="1e40af"/>
+                <w:sz w:val="18"/>
+                <w:szCs w:val="18"/>
+              </w:rPr>
+              <w:t xml:space="preserve">git branch</w:t>
+            </w:r>
+          </w:p>
+        </w:tc>
+      </w:tr>
+    </w:tbl>
+    <w:p>
+      <w:pPr>
+        <w:spacing w:after="160" w:before="0"/>
+      </w:pPr>
+      <w:r>
+        <w:rPr>
+          <w:rFonts w:ascii="Arial" w:cs="Arial" w:eastAsia="Arial" w:hAnsi="Arial"/>
+          <w:b w:val="false"/>
+          <w:bCs w:val="false"/>
+          <w:i w:val="false"/>
+          <w:iCs w:val="false"/>
+          <w:color w:val="1f2937"/>
+          <w:sz w:val="20"/>
+          <w:szCs w:val="20"/>
+        </w:rPr>
+        <w:t xml:space="preserve">The branch with a * next to it is the current one. If you are on staging, run:</w:t>
+      </w:r>
+    </w:p>
+    <w:tbl>
+      <w:tblPr>
+        <w:tblW w:type="dxa" w:w="9360"/>
+        <w:tblBorders>
+          <w:top w:val="single" w:color="auto" w:sz="4"/>
+          <w:left w:val="single" w:color="auto" w:sz="4"/>
+          <w:bottom w:val="single" w:color="auto" w:sz="4"/>
+          <w:right w:val="single" w:color="auto" w:sz="4"/>
+          <w:insideH w:val="single" w:color="auto" w:sz="4"/>
+          <w:insideV w:val="single" w:color="auto" w:sz="4"/>
+        </w:tblBorders>
+      </w:tblPr>
+      <w:tblGrid>
+        <w:gridCol w:w="9360"/>
+      </w:tblGrid>
+      <w:tr>
+        <w:tc>
+          <w:tcPr>
+            <w:tcBorders>
+              <w:top w:val="single" w:color="cbd5e1" w:sz="1"/>
+              <w:left w:val="single" w:color="cbd5e1" w:sz="1"/>
+              <w:bottom w:val="single" w:color="cbd5e1" w:sz="1"/>
+              <w:right w:val="single" w:color="cbd5e1" w:sz="1"/>
+            </w:tcBorders>
+            <w:shd w:fill="f1f5f9" w:val="clear"/>
+            <w:tcMar>
+              <w:top w:type="dxa" w:w="100"/>
+              <w:left w:type="dxa" w:w="150"/>
+              <w:bottom w:type="dxa" w:w="100"/>
+              <w:right w:type="dxa" w:w="150"/>
+            </w:tcMar>
+            <w:vAlign w:val="top"/>
+          </w:tcPr>
+          <w:p>
+            <w:pPr>
+              <w:spacing w:after="60" w:before="0"/>
+            </w:pPr>
+            <w:r>
+              <w:rPr>
+                <w:rFonts w:ascii="Courier New" w:cs="Courier New" w:eastAsia="Courier New" w:hAnsi="Courier New"/>
+                <w:color w:val="1e40af"/>
+                <w:sz w:val="18"/>
+                <w:szCs w:val="18"/>
+              </w:rPr>
+              <w:t xml:space="preserve">git checkout main</w:t>
+            </w:r>
+          </w:p>
+        </w:tc>
+      </w:tr>
+    </w:tbl>
+    <w:tbl>
+      <w:tblPr>
+        <w:tblW w:type="dxa" w:w="9360"/>
+        <w:tblBorders>
+          <w:top w:val="single" w:color="auto" w:sz="4"/>
+          <w:left w:val="single" w:color="auto" w:sz="4"/>
+          <w:bottom w:val="single" w:color="auto" w:sz="4"/>
+          <w:right w:val="single" w:color="auto" w:sz="4"/>
+          <w:insideH w:val="single" w:color="auto" w:sz="4"/>
+          <w:insideV w:val="single" w:color="auto" w:sz="4"/>
+        </w:tblBorders>
+      </w:tblPr>
+      <w:tblGrid>
+        <w:gridCol w:w="9360"/>
+      </w:tblGrid>
+      <w:tr>
+        <w:tc>
+          <w:tcPr>
+            <w:tcBorders>
+              <w:top w:val="single" w:color="cbd5e1" w:sz="1"/>
+              <w:left w:val="single" w:color="cbd5e1" w:sz="1"/>
+              <w:bottom w:val="single" w:color="cbd5e1" w:sz="1"/>
+              <w:right w:val="single" w:color="cbd5e1" w:sz="1"/>
+            </w:tcBorders>
+            <w:shd w:fill="f1f5f9" w:val="clear"/>
+            <w:tcMar>
+              <w:top w:type="dxa" w:w="100"/>
+              <w:left w:type="dxa" w:w="150"/>
+              <w:bottom w:type="dxa" w:w="100"/>
+              <w:right w:type="dxa" w:w="150"/>
+            </w:tcMar>
+            <w:vAlign w:val="top"/>
+          </w:tcPr>
+          <w:p>
+            <w:pPr>
+              <w:spacing w:after="60" w:before="0"/>
+            </w:pPr>
+            <w:r>
+              <w:rPr>
+                <w:rFonts w:ascii="Courier New" w:cs="Courier New" w:eastAsia="Courier New" w:hAnsi="Courier New"/>
+                <w:color w:val="1e40af"/>
+                <w:sz w:val="18"/>
+                <w:szCs w:val="18"/>
+              </w:rPr>
+              <w:t xml:space="preserve">git merge staging</w:t>
+            </w:r>
+          </w:p>
+        </w:tc>
+      </w:tr>
+    </w:tbl>
+    <w:tbl>
+      <w:tblPr>
+        <w:tblW w:type="dxa" w:w="9360"/>
+        <w:tblBorders>
+          <w:top w:val="single" w:color="auto" w:sz="4"/>
+          <w:left w:val="single" w:color="auto" w:sz="4"/>
+          <w:bottom w:val="single" w:color="auto" w:sz="4"/>
+          <w:right w:val="single" w:color="auto" w:sz="4"/>
+          <w:insideH w:val="single" w:color="auto" w:sz="4"/>
+          <w:insideV w:val="single" w:color="auto" w:sz="4"/>
+        </w:tblBorders>
+      </w:tblPr>
+      <w:tblGrid>
+        <w:gridCol w:w="9360"/>
+      </w:tblGrid>
+      <w:tr>
+        <w:tc>
+          <w:tcPr>
+            <w:tcBorders>
+              <w:top w:val="single" w:color="cbd5e1" w:sz="1"/>
+              <w:left w:val="single" w:color="cbd5e1" w:sz="1"/>
+              <w:bottom w:val="single" w:color="cbd5e1" w:sz="1"/>
+              <w:right w:val="single" w:color="cbd5e1" w:sz="1"/>
+            </w:tcBorders>
+            <w:shd w:fill="f1f5f9" w:val="clear"/>
+            <w:tcMar>
+              <w:top w:type="dxa" w:w="100"/>
+              <w:left w:type="dxa" w:w="150"/>
+              <w:bottom w:type="dxa" w:w="100"/>
+              <w:right w:type="dxa" w:w="150"/>
+            </w:tcMar>
+            <w:vAlign w:val="top"/>
+          </w:tcPr>
+          <w:p>
+            <w:pPr>
+              <w:spacing w:after="60" w:before="0"/>
+            </w:pPr>
+            <w:r>
+              <w:rPr>
+                <w:rFonts w:ascii="Courier New" w:cs="Courier New" w:eastAsia="Courier New" w:hAnsi="Courier New"/>
+                <w:color w:val="1e40af"/>
+                <w:sz w:val="18"/>
+                <w:szCs w:val="18"/>
+              </w:rPr>
+              <w:t xml:space="preserve">git push origin main</w:t>
+            </w:r>
+          </w:p>
+        </w:tc>
+      </w:tr>
+    </w:tbl>
+    <w:p>
+      <w:pPr>
+        <w:spacing w:after="160" w:before="0"/>
+      </w:pPr>
+      <w:r>
+        <w:rPr>
+          <w:rFonts w:ascii="Arial" w:cs="Arial" w:eastAsia="Arial" w:hAnsi="Arial"/>
+          <w:b w:val="false"/>
+          <w:bCs w:val="false"/>
+          <w:i w:val="false"/>
+          <w:iCs w:val="false"/>
+          <w:color w:val="1f2937"/>
+          <w:sz w:val="20"/>
+          <w:szCs w:val="20"/>
+        </w:rPr>
+        <w:t xml:space="preserve"/>
+      </w:r>
+    </w:p>
+    <w:p>
+      <w:pPr>
+        <w:pStyle w:val="Heading2"/>
+        <w:spacing w:after="160" w:before="320"/>
+      </w:pPr>
+      <w:r>
+        <w:rPr>
+          <w:rFonts w:ascii="Arial" w:cs="Arial" w:eastAsia="Arial" w:hAnsi="Arial"/>
+          <w:b/>
+          <w:bCs/>
+          <w:color w:val="267c88"/>
+          <w:sz w:val="28"/>
+          <w:szCs w:val="28"/>
+        </w:rPr>
         <w:t xml:space="preserve">Problem: My changes are not showing on the live site</w:t>
       </w:r>
     </w:p>
@@ -9647,7 +10411,7 @@
           <w:sz w:val="20"/>
           <w:szCs w:val="20"/>
         </w:rPr>
-        <w:t xml:space="preserve">Check that you ran all three Git commands: git add .  then  git commit  then  git push</w:t>
+        <w:t xml:space="preserve">Make sure you followed the full five-step sequence: git add . → git commit → git checkout main → git merge staging → git push origin main</w:t>
       </w:r>
     </w:p>
     <w:p>
@@ -9668,7 +10432,7 @@
           <w:sz w:val="20"/>
           <w:szCs w:val="20"/>
         </w:rPr>
-        <w:t xml:space="preserve">Check Cloudflare Pages dashboard to see if the latest deployment has a green tick or a red error</w:t>
+        <w:t xml:space="preserve">Check Cloudflare Pages dashboard to see if the latest deployment next to 'main' has a green tick or a red error</w:t>
       </w:r>
     </w:p>
     <w:p>

</xml_diff>